<commit_message>
Coherencia institucional: Universidad Senor de Sipan (Pimentel, Peru)
- Hero, footer y alt del logo actualizados (sin 'San Sebastian / Magister')
- Refrescados archivos en descargas/ (tesis, historia del cobre, compendio)

Co-Authored-By: Claude Opus 4.8 <noreply@anthropic.com>
</commit_message>
<xml_diff>
--- a/descargas/Tesis_Francisco_Rietta.docx
+++ b/descargas/Tesis_Francisco_Rietta.docx
@@ -254,7 +254,7 @@
       <w:pPr>
         <w:pStyle w:val="Ttulo1"/>
       </w:pPr>
-      <w:bookmarkStart w:id="0" w:name="_Toc231121707"/>
+      <w:bookmarkStart w:id="0" w:name="_Toc231135533"/>
       <w:r>
         <w:lastRenderedPageBreak/>
         <w:t>Página de aprobación</w:t>
@@ -268,7 +268,7 @@
         </w:rPr>
       </w:pPr>
       <w:r>
-        <w:t>La presente tesis ha sido revisada y aprobada por la comisión examinadora abajo firmante, como requisito para optar al grado de Magíster en Data Science de la Universidad San Sebastián.</w:t>
+        <w:t>La presente tesis ha sido revisada y aprobada por la comisión examinadora abajo firmante, como requisito para optar el título profesional / grado académico de [Grado o Título] en la Universidad Señor de Sipán.</w:t>
       </w:r>
     </w:p>
     <w:p>
@@ -385,7 +385,10 @@
         </w:rPr>
       </w:pPr>
       <w:r>
-        <w:t>Calificación final: __________        Fecha: ____ / ____ / ______</w:t>
+        <w:t xml:space="preserve">Calificación final: __________        Fecha: ____ / ____ / </w:t>
+      </w:r>
+      <w:r>
+        <w:t>______</w:t>
       </w:r>
     </w:p>
     <w:p>
@@ -402,7 +405,7 @@
       <w:pPr>
         <w:pStyle w:val="Ttulo1"/>
       </w:pPr>
-      <w:bookmarkStart w:id="1" w:name="_Toc231121708"/>
+      <w:bookmarkStart w:id="1" w:name="_Toc231135534"/>
       <w:r>
         <w:lastRenderedPageBreak/>
         <w:t>Declaración de originalidad</w:t>
@@ -477,7 +480,7 @@
       <w:pPr>
         <w:pStyle w:val="Ttulo1"/>
       </w:pPr>
-      <w:bookmarkStart w:id="2" w:name="_Toc231121709"/>
+      <w:bookmarkStart w:id="2" w:name="_Toc231135535"/>
       <w:r>
         <w:lastRenderedPageBreak/>
         <w:t>Dedicatoria</w:t>
@@ -527,7 +530,7 @@
       <w:pPr>
         <w:pStyle w:val="Ttulo1"/>
       </w:pPr>
-      <w:bookmarkStart w:id="3" w:name="_Toc231121710"/>
+      <w:bookmarkStart w:id="3" w:name="_Toc231135536"/>
       <w:r>
         <w:lastRenderedPageBreak/>
         <w:t>Agradecimientos</w:t>
@@ -575,7 +578,7 @@
       <w:pPr>
         <w:pStyle w:val="Ttulo1"/>
       </w:pPr>
-      <w:bookmarkStart w:id="4" w:name="_Toc231121711"/>
+      <w:bookmarkStart w:id="4" w:name="_Toc231135537"/>
       <w:r>
         <w:lastRenderedPageBreak/>
         <w:t>Resumen</w:t>
@@ -628,7 +631,7 @@
       <w:pPr>
         <w:pStyle w:val="Ttulo1"/>
       </w:pPr>
-      <w:bookmarkStart w:id="5" w:name="_Toc231121712"/>
+      <w:bookmarkStart w:id="5" w:name="_Toc231135538"/>
       <w:r>
         <w:lastRenderedPageBreak/>
         <w:t>Abstract</w:t>
@@ -678,7 +681,7 @@
       <w:pPr>
         <w:pStyle w:val="Ttulo1"/>
       </w:pPr>
-      <w:bookmarkStart w:id="6" w:name="_Toc231121713"/>
+      <w:bookmarkStart w:id="6" w:name="_Toc231135539"/>
       <w:r>
         <w:lastRenderedPageBreak/>
         <w:t>Índice general</w:t>
@@ -710,7 +713,7 @@
       <w:r>
         <w:fldChar w:fldCharType="separate"/>
       </w:r>
-      <w:hyperlink w:anchor="_Toc231121707" w:history="1">
+      <w:hyperlink w:anchor="_Toc231135533" w:history="1">
         <w:r>
           <w:rPr>
             <w:rStyle w:val="Hipervnculo"/>
@@ -737,7 +740,7 @@
             <w:noProof/>
             <w:webHidden/>
           </w:rPr>
-          <w:instrText xml:space="preserve"> PAGEREF _Toc231121707 \h </w:instrText>
+          <w:instrText xml:space="preserve"> PAGEREF _Toc231135533 \h </w:instrText>
         </w:r>
         <w:r>
           <w:rPr>
@@ -784,7 +787,7 @@
           <w14:ligatures w14:val="standardContextual"/>
         </w:rPr>
       </w:pPr>
-      <w:hyperlink w:anchor="_Toc231121708" w:history="1">
+      <w:hyperlink w:anchor="_Toc231135534" w:history="1">
         <w:r>
           <w:rPr>
             <w:rStyle w:val="Hipervnculo"/>
@@ -811,7 +814,7 @@
             <w:noProof/>
             <w:webHidden/>
           </w:rPr>
-          <w:instrText xml:space="preserve"> PAGEREF _Toc231121708 \h </w:instrText>
+          <w:instrText xml:space="preserve"> PAGEREF _Toc231135534 \h </w:instrText>
         </w:r>
         <w:r>
           <w:rPr>
@@ -858,7 +861,7 @@
           <w14:ligatures w14:val="standardContextual"/>
         </w:rPr>
       </w:pPr>
-      <w:hyperlink w:anchor="_Toc231121709" w:history="1">
+      <w:hyperlink w:anchor="_Toc231135535" w:history="1">
         <w:r>
           <w:rPr>
             <w:rStyle w:val="Hipervnculo"/>
@@ -885,7 +888,7 @@
             <w:noProof/>
             <w:webHidden/>
           </w:rPr>
-          <w:instrText xml:space="preserve"> PAGEREF _Toc231121709 \h </w:instrText>
+          <w:instrText xml:space="preserve"> PAGEREF _Toc231135535 \h </w:instrText>
         </w:r>
         <w:r>
           <w:rPr>
@@ -932,7 +935,7 @@
           <w14:ligatures w14:val="standardContextual"/>
         </w:rPr>
       </w:pPr>
-      <w:hyperlink w:anchor="_Toc231121710" w:history="1">
+      <w:hyperlink w:anchor="_Toc231135536" w:history="1">
         <w:r>
           <w:rPr>
             <w:rStyle w:val="Hipervnculo"/>
@@ -959,7 +962,7 @@
             <w:noProof/>
             <w:webHidden/>
           </w:rPr>
-          <w:instrText xml:space="preserve"> PAGEREF _Toc231121710 \h </w:instrText>
+          <w:instrText xml:space="preserve"> PAGEREF _Toc231135536 \h </w:instrText>
         </w:r>
         <w:r>
           <w:rPr>
@@ -1006,7 +1009,7 @@
           <w14:ligatures w14:val="standardContextual"/>
         </w:rPr>
       </w:pPr>
-      <w:hyperlink w:anchor="_Toc231121711" w:history="1">
+      <w:hyperlink w:anchor="_Toc231135537" w:history="1">
         <w:r>
           <w:rPr>
             <w:rStyle w:val="Hipervnculo"/>
@@ -1033,7 +1036,7 @@
             <w:noProof/>
             <w:webHidden/>
           </w:rPr>
-          <w:instrText xml:space="preserve"> PAGEREF _Toc231121711 \h </w:instrText>
+          <w:instrText xml:space="preserve"> PAGEREF _Toc231135537 \h </w:instrText>
         </w:r>
         <w:r>
           <w:rPr>
@@ -1080,7 +1083,7 @@
           <w14:ligatures w14:val="standardContextual"/>
         </w:rPr>
       </w:pPr>
-      <w:hyperlink w:anchor="_Toc231121712" w:history="1">
+      <w:hyperlink w:anchor="_Toc231135538" w:history="1">
         <w:r>
           <w:rPr>
             <w:rStyle w:val="Hipervnculo"/>
@@ -1107,7 +1110,7 @@
             <w:noProof/>
             <w:webHidden/>
           </w:rPr>
-          <w:instrText xml:space="preserve"> PAGEREF _Toc231121712 \h </w:instrText>
+          <w:instrText xml:space="preserve"> PAGEREF _Toc231135538 \h </w:instrText>
         </w:r>
         <w:r>
           <w:rPr>
@@ -1154,7 +1157,7 @@
           <w14:ligatures w14:val="standardContextual"/>
         </w:rPr>
       </w:pPr>
-      <w:hyperlink w:anchor="_Toc231121713" w:history="1">
+      <w:hyperlink w:anchor="_Toc231135539" w:history="1">
         <w:r>
           <w:rPr>
             <w:rStyle w:val="Hipervnculo"/>
@@ -1181,7 +1184,7 @@
             <w:noProof/>
             <w:webHidden/>
           </w:rPr>
-          <w:instrText xml:space="preserve"> PAGEREF _Toc231121713 \h </w:instrText>
+          <w:instrText xml:space="preserve"> PAGEREF _Toc231135539 \h </w:instrText>
         </w:r>
         <w:r>
           <w:rPr>
@@ -1228,7 +1231,7 @@
           <w14:ligatures w14:val="standardContextual"/>
         </w:rPr>
       </w:pPr>
-      <w:hyperlink w:anchor="_Toc231121714" w:history="1">
+      <w:hyperlink w:anchor="_Toc231135540" w:history="1">
         <w:r>
           <w:rPr>
             <w:rStyle w:val="Hipervnculo"/>
@@ -1255,7 +1258,7 @@
             <w:noProof/>
             <w:webHidden/>
           </w:rPr>
-          <w:instrText xml:space="preserve"> PAGEREF _Toc231121714 \h </w:instrText>
+          <w:instrText xml:space="preserve"> PAGEREF _Toc231135540 \h </w:instrText>
         </w:r>
         <w:r>
           <w:rPr>
@@ -1302,7 +1305,7 @@
           <w14:ligatures w14:val="standardContextual"/>
         </w:rPr>
       </w:pPr>
-      <w:hyperlink w:anchor="_Toc231121715" w:history="1">
+      <w:hyperlink w:anchor="_Toc231135541" w:history="1">
         <w:r>
           <w:rPr>
             <w:rStyle w:val="Hipervnculo"/>
@@ -1329,7 +1332,7 @@
             <w:noProof/>
             <w:webHidden/>
           </w:rPr>
-          <w:instrText xml:space="preserve"> PAGEREF _Toc231121715 \h </w:instrText>
+          <w:instrText xml:space="preserve"> PAGEREF _Toc231135541 \h </w:instrText>
         </w:r>
         <w:r>
           <w:rPr>
@@ -1376,7 +1379,7 @@
           <w14:ligatures w14:val="standardContextual"/>
         </w:rPr>
       </w:pPr>
-      <w:hyperlink w:anchor="_Toc231121716" w:history="1">
+      <w:hyperlink w:anchor="_Toc231135542" w:history="1">
         <w:r>
           <w:rPr>
             <w:rStyle w:val="Hipervnculo"/>
@@ -1403,7 +1406,7 @@
             <w:noProof/>
             <w:webHidden/>
           </w:rPr>
-          <w:instrText xml:space="preserve"> PAGEREF _Toc231121716 \h </w:instrText>
+          <w:instrText xml:space="preserve"> PAGEREF _Toc231135542 \h </w:instrText>
         </w:r>
         <w:r>
           <w:rPr>
@@ -1450,7 +1453,7 @@
           <w14:ligatures w14:val="standardContextual"/>
         </w:rPr>
       </w:pPr>
-      <w:hyperlink w:anchor="_Toc231121717" w:history="1">
+      <w:hyperlink w:anchor="_Toc231135543" w:history="1">
         <w:r>
           <w:rPr>
             <w:rStyle w:val="Hipervnculo"/>
@@ -1477,7 +1480,7 @@
             <w:noProof/>
             <w:webHidden/>
           </w:rPr>
-          <w:instrText xml:space="preserve"> PAGEREF _Toc231121717 \h </w:instrText>
+          <w:instrText xml:space="preserve"> PAGEREF _Toc231135543 \h </w:instrText>
         </w:r>
         <w:r>
           <w:rPr>
@@ -1524,7 +1527,7 @@
           <w14:ligatures w14:val="standardContextual"/>
         </w:rPr>
       </w:pPr>
-      <w:hyperlink w:anchor="_Toc231121718" w:history="1">
+      <w:hyperlink w:anchor="_Toc231135544" w:history="1">
         <w:r>
           <w:rPr>
             <w:rStyle w:val="Hipervnculo"/>
@@ -1551,7 +1554,7 @@
             <w:noProof/>
             <w:webHidden/>
           </w:rPr>
-          <w:instrText xml:space="preserve"> PAGEREF _Toc231121718 \h </w:instrText>
+          <w:instrText xml:space="preserve"> PAGEREF _Toc231135544 \h </w:instrText>
         </w:r>
         <w:r>
           <w:rPr>
@@ -1598,7 +1601,7 @@
           <w14:ligatures w14:val="standardContextual"/>
         </w:rPr>
       </w:pPr>
-      <w:hyperlink w:anchor="_Toc231121719" w:history="1">
+      <w:hyperlink w:anchor="_Toc231135545" w:history="1">
         <w:r>
           <w:rPr>
             <w:rStyle w:val="Hipervnculo"/>
@@ -1625,7 +1628,7 @@
             <w:noProof/>
             <w:webHidden/>
           </w:rPr>
-          <w:instrText xml:space="preserve"> PAGEREF _Toc231121719 \h </w:instrText>
+          <w:instrText xml:space="preserve"> PAGEREF _Toc231135545 \h </w:instrText>
         </w:r>
         <w:r>
           <w:rPr>
@@ -1672,7 +1675,7 @@
           <w14:ligatures w14:val="standardContextual"/>
         </w:rPr>
       </w:pPr>
-      <w:hyperlink w:anchor="_Toc231121720" w:history="1">
+      <w:hyperlink w:anchor="_Toc231135546" w:history="1">
         <w:r>
           <w:rPr>
             <w:rStyle w:val="Hipervnculo"/>
@@ -1699,7 +1702,7 @@
             <w:noProof/>
             <w:webHidden/>
           </w:rPr>
-          <w:instrText xml:space="preserve"> PAGEREF _Toc231121720 \h </w:instrText>
+          <w:instrText xml:space="preserve"> PAGEREF _Toc231135546 \h </w:instrText>
         </w:r>
         <w:r>
           <w:rPr>
@@ -1746,7 +1749,7 @@
           <w14:ligatures w14:val="standardContextual"/>
         </w:rPr>
       </w:pPr>
-      <w:hyperlink w:anchor="_Toc231121721" w:history="1">
+      <w:hyperlink w:anchor="_Toc231135547" w:history="1">
         <w:r>
           <w:rPr>
             <w:rStyle w:val="Hipervnculo"/>
@@ -1773,7 +1776,7 @@
             <w:noProof/>
             <w:webHidden/>
           </w:rPr>
-          <w:instrText xml:space="preserve"> PAGEREF _Toc231121721 \h </w:instrText>
+          <w:instrText xml:space="preserve"> PAGEREF _Toc231135547 \h </w:instrText>
         </w:r>
         <w:r>
           <w:rPr>
@@ -1820,7 +1823,7 @@
           <w14:ligatures w14:val="standardContextual"/>
         </w:rPr>
       </w:pPr>
-      <w:hyperlink w:anchor="_Toc231121722" w:history="1">
+      <w:hyperlink w:anchor="_Toc231135548" w:history="1">
         <w:r>
           <w:rPr>
             <w:rStyle w:val="Hipervnculo"/>
@@ -1847,7 +1850,7 @@
             <w:noProof/>
             <w:webHidden/>
           </w:rPr>
-          <w:instrText xml:space="preserve"> PAGEREF _Toc231121722 \h </w:instrText>
+          <w:instrText xml:space="preserve"> PAGEREF _Toc231135548 \h </w:instrText>
         </w:r>
         <w:r>
           <w:rPr>
@@ -1894,7 +1897,7 @@
           <w14:ligatures w14:val="standardContextual"/>
         </w:rPr>
       </w:pPr>
-      <w:hyperlink w:anchor="_Toc231121723" w:history="1">
+      <w:hyperlink w:anchor="_Toc231135549" w:history="1">
         <w:r>
           <w:rPr>
             <w:rStyle w:val="Hipervnculo"/>
@@ -1921,7 +1924,7 @@
             <w:noProof/>
             <w:webHidden/>
           </w:rPr>
-          <w:instrText xml:space="preserve"> PAGEREF _Toc231121723 \h </w:instrText>
+          <w:instrText xml:space="preserve"> PAGEREF _Toc231135549 \h </w:instrText>
         </w:r>
         <w:r>
           <w:rPr>
@@ -1968,7 +1971,7 @@
           <w14:ligatures w14:val="standardContextual"/>
         </w:rPr>
       </w:pPr>
-      <w:hyperlink w:anchor="_Toc231121724" w:history="1">
+      <w:hyperlink w:anchor="_Toc231135550" w:history="1">
         <w:r>
           <w:rPr>
             <w:rStyle w:val="Hipervnculo"/>
@@ -1995,7 +1998,7 @@
             <w:noProof/>
             <w:webHidden/>
           </w:rPr>
-          <w:instrText xml:space="preserve"> PAGEREF _Toc231121724 \h </w:instrText>
+          <w:instrText xml:space="preserve"> PAGEREF _Toc231135550 \h </w:instrText>
         </w:r>
         <w:r>
           <w:rPr>
@@ -2042,7 +2045,7 @@
           <w14:ligatures w14:val="standardContextual"/>
         </w:rPr>
       </w:pPr>
-      <w:hyperlink w:anchor="_Toc231121725" w:history="1">
+      <w:hyperlink w:anchor="_Toc231135551" w:history="1">
         <w:r>
           <w:rPr>
             <w:rStyle w:val="Hipervnculo"/>
@@ -2069,7 +2072,7 @@
             <w:noProof/>
             <w:webHidden/>
           </w:rPr>
-          <w:instrText xml:space="preserve"> PAGEREF _Toc231121725 \h </w:instrText>
+          <w:instrText xml:space="preserve"> PAGEREF _Toc231135551 \h </w:instrText>
         </w:r>
         <w:r>
           <w:rPr>
@@ -2116,7 +2119,7 @@
           <w14:ligatures w14:val="standardContextual"/>
         </w:rPr>
       </w:pPr>
-      <w:hyperlink w:anchor="_Toc231121726" w:history="1">
+      <w:hyperlink w:anchor="_Toc231135552" w:history="1">
         <w:r>
           <w:rPr>
             <w:rStyle w:val="Hipervnculo"/>
@@ -2143,7 +2146,7 @@
             <w:noProof/>
             <w:webHidden/>
           </w:rPr>
-          <w:instrText xml:space="preserve"> PAGEREF _Toc231121726 \h </w:instrText>
+          <w:instrText xml:space="preserve"> PAGEREF _Toc231135552 \h </w:instrText>
         </w:r>
         <w:r>
           <w:rPr>
@@ -2190,7 +2193,7 @@
           <w14:ligatures w14:val="standardContextual"/>
         </w:rPr>
       </w:pPr>
-      <w:hyperlink w:anchor="_Toc231121727" w:history="1">
+      <w:hyperlink w:anchor="_Toc231135553" w:history="1">
         <w:r>
           <w:rPr>
             <w:rStyle w:val="Hipervnculo"/>
@@ -2217,7 +2220,7 @@
             <w:noProof/>
             <w:webHidden/>
           </w:rPr>
-          <w:instrText xml:space="preserve"> PAGEREF _Toc231121727 \h </w:instrText>
+          <w:instrText xml:space="preserve"> PAGEREF _Toc231135553 \h </w:instrText>
         </w:r>
         <w:r>
           <w:rPr>
@@ -2264,7 +2267,7 @@
           <w14:ligatures w14:val="standardContextual"/>
         </w:rPr>
       </w:pPr>
-      <w:hyperlink w:anchor="_Toc231121728" w:history="1">
+      <w:hyperlink w:anchor="_Toc231135554" w:history="1">
         <w:r>
           <w:rPr>
             <w:rStyle w:val="Hipervnculo"/>
@@ -2291,7 +2294,7 @@
             <w:noProof/>
             <w:webHidden/>
           </w:rPr>
-          <w:instrText xml:space="preserve"> PAGEREF _Toc231121728 \h </w:instrText>
+          <w:instrText xml:space="preserve"> PAGEREF _Toc231135554 \h </w:instrText>
         </w:r>
         <w:r>
           <w:rPr>
@@ -2338,7 +2341,7 @@
           <w14:ligatures w14:val="standardContextual"/>
         </w:rPr>
       </w:pPr>
-      <w:hyperlink w:anchor="_Toc231121729" w:history="1">
+      <w:hyperlink w:anchor="_Toc231135555" w:history="1">
         <w:r>
           <w:rPr>
             <w:rStyle w:val="Hipervnculo"/>
@@ -2365,7 +2368,7 @@
             <w:noProof/>
             <w:webHidden/>
           </w:rPr>
-          <w:instrText xml:space="preserve"> PAGEREF _Toc231121729 \h </w:instrText>
+          <w:instrText xml:space="preserve"> PAGEREF _Toc231135555 \h </w:instrText>
         </w:r>
         <w:r>
           <w:rPr>
@@ -2412,7 +2415,7 @@
           <w14:ligatures w14:val="standardContextual"/>
         </w:rPr>
       </w:pPr>
-      <w:hyperlink w:anchor="_Toc231121730" w:history="1">
+      <w:hyperlink w:anchor="_Toc231135556" w:history="1">
         <w:r>
           <w:rPr>
             <w:rStyle w:val="Hipervnculo"/>
@@ -2439,7 +2442,7 @@
             <w:noProof/>
             <w:webHidden/>
           </w:rPr>
-          <w:instrText xml:space="preserve"> PAGEREF _Toc231121730 \h </w:instrText>
+          <w:instrText xml:space="preserve"> PAGEREF _Toc231135556 \h </w:instrText>
         </w:r>
         <w:r>
           <w:rPr>
@@ -2486,7 +2489,7 @@
           <w14:ligatures w14:val="standardContextual"/>
         </w:rPr>
       </w:pPr>
-      <w:hyperlink w:anchor="_Toc231121731" w:history="1">
+      <w:hyperlink w:anchor="_Toc231135557" w:history="1">
         <w:r>
           <w:rPr>
             <w:rStyle w:val="Hipervnculo"/>
@@ -2513,7 +2516,7 @@
             <w:noProof/>
             <w:webHidden/>
           </w:rPr>
-          <w:instrText xml:space="preserve"> PAGEREF _Toc231121731 \h </w:instrText>
+          <w:instrText xml:space="preserve"> PAGEREF _Toc231135557 \h </w:instrText>
         </w:r>
         <w:r>
           <w:rPr>
@@ -2560,7 +2563,7 @@
           <w14:ligatures w14:val="standardContextual"/>
         </w:rPr>
       </w:pPr>
-      <w:hyperlink w:anchor="_Toc231121732" w:history="1">
+      <w:hyperlink w:anchor="_Toc231135558" w:history="1">
         <w:r>
           <w:rPr>
             <w:rStyle w:val="Hipervnculo"/>
@@ -2587,7 +2590,7 @@
             <w:noProof/>
             <w:webHidden/>
           </w:rPr>
-          <w:instrText xml:space="preserve"> PAGEREF _Toc231121732 \h </w:instrText>
+          <w:instrText xml:space="preserve"> PAGEREF _Toc231135558 \h </w:instrText>
         </w:r>
         <w:r>
           <w:rPr>
@@ -2634,7 +2637,7 @@
           <w14:ligatures w14:val="standardContextual"/>
         </w:rPr>
       </w:pPr>
-      <w:hyperlink w:anchor="_Toc231121733" w:history="1">
+      <w:hyperlink w:anchor="_Toc231135559" w:history="1">
         <w:r>
           <w:rPr>
             <w:rStyle w:val="Hipervnculo"/>
@@ -2661,7 +2664,7 @@
             <w:noProof/>
             <w:webHidden/>
           </w:rPr>
-          <w:instrText xml:space="preserve"> PAGEREF _Toc231121733 \h </w:instrText>
+          <w:instrText xml:space="preserve"> PAGEREF _Toc231135559 \h </w:instrText>
         </w:r>
         <w:r>
           <w:rPr>
@@ -2708,7 +2711,7 @@
           <w14:ligatures w14:val="standardContextual"/>
         </w:rPr>
       </w:pPr>
-      <w:hyperlink w:anchor="_Toc231121734" w:history="1">
+      <w:hyperlink w:anchor="_Toc231135560" w:history="1">
         <w:r>
           <w:rPr>
             <w:rStyle w:val="Hipervnculo"/>
@@ -2735,7 +2738,7 @@
             <w:noProof/>
             <w:webHidden/>
           </w:rPr>
-          <w:instrText xml:space="preserve"> PAGEREF _Toc231121734 \h </w:instrText>
+          <w:instrText xml:space="preserve"> PAGEREF _Toc231135560 \h </w:instrText>
         </w:r>
         <w:r>
           <w:rPr>
@@ -2782,7 +2785,7 @@
           <w14:ligatures w14:val="standardContextual"/>
         </w:rPr>
       </w:pPr>
-      <w:hyperlink w:anchor="_Toc231121735" w:history="1">
+      <w:hyperlink w:anchor="_Toc231135561" w:history="1">
         <w:r>
           <w:rPr>
             <w:rStyle w:val="Hipervnculo"/>
@@ -2809,7 +2812,7 @@
             <w:noProof/>
             <w:webHidden/>
           </w:rPr>
-          <w:instrText xml:space="preserve"> PAGEREF _Toc231121735 \h </w:instrText>
+          <w:instrText xml:space="preserve"> PAGEREF _Toc231135561 \h </w:instrText>
         </w:r>
         <w:r>
           <w:rPr>
@@ -2856,7 +2859,7 @@
           <w14:ligatures w14:val="standardContextual"/>
         </w:rPr>
       </w:pPr>
-      <w:hyperlink w:anchor="_Toc231121736" w:history="1">
+      <w:hyperlink w:anchor="_Toc231135562" w:history="1">
         <w:r>
           <w:rPr>
             <w:rStyle w:val="Hipervnculo"/>
@@ -2883,7 +2886,7 @@
             <w:noProof/>
             <w:webHidden/>
           </w:rPr>
-          <w:instrText xml:space="preserve"> PAGEREF _Toc231121736 \h </w:instrText>
+          <w:instrText xml:space="preserve"> PAGEREF _Toc231135562 \h </w:instrText>
         </w:r>
         <w:r>
           <w:rPr>
@@ -2930,7 +2933,7 @@
           <w14:ligatures w14:val="standardContextual"/>
         </w:rPr>
       </w:pPr>
-      <w:hyperlink w:anchor="_Toc231121737" w:history="1">
+      <w:hyperlink w:anchor="_Toc231135563" w:history="1">
         <w:r>
           <w:rPr>
             <w:rStyle w:val="Hipervnculo"/>
@@ -2957,7 +2960,7 @@
             <w:noProof/>
             <w:webHidden/>
           </w:rPr>
-          <w:instrText xml:space="preserve"> PAGEREF _Toc231121737 \h </w:instrText>
+          <w:instrText xml:space="preserve"> PAGEREF _Toc231135563 \h </w:instrText>
         </w:r>
         <w:r>
           <w:rPr>
@@ -3004,7 +3007,7 @@
           <w14:ligatures w14:val="standardContextual"/>
         </w:rPr>
       </w:pPr>
-      <w:hyperlink w:anchor="_Toc231121738" w:history="1">
+      <w:hyperlink w:anchor="_Toc231135564" w:history="1">
         <w:r>
           <w:rPr>
             <w:rStyle w:val="Hipervnculo"/>
@@ -3031,7 +3034,7 @@
             <w:noProof/>
             <w:webHidden/>
           </w:rPr>
-          <w:instrText xml:space="preserve"> PAGEREF _Toc231121738 \h </w:instrText>
+          <w:instrText xml:space="preserve"> PAGEREF _Toc231135564 \h </w:instrText>
         </w:r>
         <w:r>
           <w:rPr>
@@ -3078,7 +3081,7 @@
           <w14:ligatures w14:val="standardContextual"/>
         </w:rPr>
       </w:pPr>
-      <w:hyperlink w:anchor="_Toc231121739" w:history="1">
+      <w:hyperlink w:anchor="_Toc231135565" w:history="1">
         <w:r>
           <w:rPr>
             <w:rStyle w:val="Hipervnculo"/>
@@ -3105,7 +3108,7 @@
             <w:noProof/>
             <w:webHidden/>
           </w:rPr>
-          <w:instrText xml:space="preserve"> PAGEREF _Toc231121739 \h </w:instrText>
+          <w:instrText xml:space="preserve"> PAGEREF _Toc231135565 \h </w:instrText>
         </w:r>
         <w:r>
           <w:rPr>
@@ -3152,7 +3155,7 @@
           <w14:ligatures w14:val="standardContextual"/>
         </w:rPr>
       </w:pPr>
-      <w:hyperlink w:anchor="_Toc231121740" w:history="1">
+      <w:hyperlink w:anchor="_Toc231135566" w:history="1">
         <w:r>
           <w:rPr>
             <w:rStyle w:val="Hipervnculo"/>
@@ -3179,7 +3182,7 @@
             <w:noProof/>
             <w:webHidden/>
           </w:rPr>
-          <w:instrText xml:space="preserve"> PAGEREF _Toc231121740 \h </w:instrText>
+          <w:instrText xml:space="preserve"> PAGEREF _Toc231135566 \h </w:instrText>
         </w:r>
         <w:r>
           <w:rPr>
@@ -3226,7 +3229,7 @@
           <w14:ligatures w14:val="standardContextual"/>
         </w:rPr>
       </w:pPr>
-      <w:hyperlink w:anchor="_Toc231121741" w:history="1">
+      <w:hyperlink w:anchor="_Toc231135567" w:history="1">
         <w:r>
           <w:rPr>
             <w:rStyle w:val="Hipervnculo"/>
@@ -3253,7 +3256,7 @@
             <w:noProof/>
             <w:webHidden/>
           </w:rPr>
-          <w:instrText xml:space="preserve"> PAGEREF _Toc231121741 \h </w:instrText>
+          <w:instrText xml:space="preserve"> PAGEREF _Toc231135567 \h </w:instrText>
         </w:r>
         <w:r>
           <w:rPr>
@@ -3300,7 +3303,7 @@
           <w14:ligatures w14:val="standardContextual"/>
         </w:rPr>
       </w:pPr>
-      <w:hyperlink w:anchor="_Toc231121742" w:history="1">
+      <w:hyperlink w:anchor="_Toc231135568" w:history="1">
         <w:r>
           <w:rPr>
             <w:rStyle w:val="Hipervnculo"/>
@@ -3327,7 +3330,7 @@
             <w:noProof/>
             <w:webHidden/>
           </w:rPr>
-          <w:instrText xml:space="preserve"> PAGEREF _Toc231121742 \h </w:instrText>
+          <w:instrText xml:space="preserve"> PAGEREF _Toc231135568 \h </w:instrText>
         </w:r>
         <w:r>
           <w:rPr>
@@ -3374,7 +3377,7 @@
           <w14:ligatures w14:val="standardContextual"/>
         </w:rPr>
       </w:pPr>
-      <w:hyperlink w:anchor="_Toc231121743" w:history="1">
+      <w:hyperlink w:anchor="_Toc231135569" w:history="1">
         <w:r>
           <w:rPr>
             <w:rStyle w:val="Hipervnculo"/>
@@ -3401,7 +3404,7 @@
             <w:noProof/>
             <w:webHidden/>
           </w:rPr>
-          <w:instrText xml:space="preserve"> PAGEREF _Toc231121743 \h </w:instrText>
+          <w:instrText xml:space="preserve"> PAGEREF _Toc231135569 \h </w:instrText>
         </w:r>
         <w:r>
           <w:rPr>
@@ -3448,7 +3451,7 @@
           <w14:ligatures w14:val="standardContextual"/>
         </w:rPr>
       </w:pPr>
-      <w:hyperlink w:anchor="_Toc231121744" w:history="1">
+      <w:hyperlink w:anchor="_Toc231135570" w:history="1">
         <w:r>
           <w:rPr>
             <w:rStyle w:val="Hipervnculo"/>
@@ -3475,7 +3478,7 @@
             <w:noProof/>
             <w:webHidden/>
           </w:rPr>
-          <w:instrText xml:space="preserve"> PAGEREF _Toc231121744 \h </w:instrText>
+          <w:instrText xml:space="preserve"> PAGEREF _Toc231135570 \h </w:instrText>
         </w:r>
         <w:r>
           <w:rPr>
@@ -3522,7 +3525,7 @@
           <w14:ligatures w14:val="standardContextual"/>
         </w:rPr>
       </w:pPr>
-      <w:hyperlink w:anchor="_Toc231121745" w:history="1">
+      <w:hyperlink w:anchor="_Toc231135571" w:history="1">
         <w:r>
           <w:rPr>
             <w:rStyle w:val="Hipervnculo"/>
@@ -3549,7 +3552,7 @@
             <w:noProof/>
             <w:webHidden/>
           </w:rPr>
-          <w:instrText xml:space="preserve"> PAGEREF _Toc231121745 \h </w:instrText>
+          <w:instrText xml:space="preserve"> PAGEREF _Toc231135571 \h </w:instrText>
         </w:r>
         <w:r>
           <w:rPr>
@@ -3596,7 +3599,7 @@
           <w14:ligatures w14:val="standardContextual"/>
         </w:rPr>
       </w:pPr>
-      <w:hyperlink w:anchor="_Toc231121746" w:history="1">
+      <w:hyperlink w:anchor="_Toc231135572" w:history="1">
         <w:r>
           <w:rPr>
             <w:rStyle w:val="Hipervnculo"/>
@@ -3623,7 +3626,7 @@
             <w:noProof/>
             <w:webHidden/>
           </w:rPr>
-          <w:instrText xml:space="preserve"> PAGEREF _Toc231121746 \h </w:instrText>
+          <w:instrText xml:space="preserve"> PAGEREF _Toc231135572 \h </w:instrText>
         </w:r>
         <w:r>
           <w:rPr>
@@ -3670,7 +3673,7 @@
           <w14:ligatures w14:val="standardContextual"/>
         </w:rPr>
       </w:pPr>
-      <w:hyperlink w:anchor="_Toc231121747" w:history="1">
+      <w:hyperlink w:anchor="_Toc231135573" w:history="1">
         <w:r>
           <w:rPr>
             <w:rStyle w:val="Hipervnculo"/>
@@ -3697,7 +3700,7 @@
             <w:noProof/>
             <w:webHidden/>
           </w:rPr>
-          <w:instrText xml:space="preserve"> PAGEREF _Toc231121747 \h </w:instrText>
+          <w:instrText xml:space="preserve"> PAGEREF _Toc231135573 \h </w:instrText>
         </w:r>
         <w:r>
           <w:rPr>
@@ -3744,7 +3747,7 @@
           <w14:ligatures w14:val="standardContextual"/>
         </w:rPr>
       </w:pPr>
-      <w:hyperlink w:anchor="_Toc231121748" w:history="1">
+      <w:hyperlink w:anchor="_Toc231135574" w:history="1">
         <w:r>
           <w:rPr>
             <w:rStyle w:val="Hipervnculo"/>
@@ -3771,7 +3774,7 @@
             <w:noProof/>
             <w:webHidden/>
           </w:rPr>
-          <w:instrText xml:space="preserve"> PAGEREF _Toc231121748 \h </w:instrText>
+          <w:instrText xml:space="preserve"> PAGEREF _Toc231135574 \h </w:instrText>
         </w:r>
         <w:r>
           <w:rPr>
@@ -3818,7 +3821,7 @@
           <w14:ligatures w14:val="standardContextual"/>
         </w:rPr>
       </w:pPr>
-      <w:hyperlink w:anchor="_Toc231121749" w:history="1">
+      <w:hyperlink w:anchor="_Toc231135575" w:history="1">
         <w:r>
           <w:rPr>
             <w:rStyle w:val="Hipervnculo"/>
@@ -3845,7 +3848,7 @@
             <w:noProof/>
             <w:webHidden/>
           </w:rPr>
-          <w:instrText xml:space="preserve"> PAGEREF _Toc231121749 \h </w:instrText>
+          <w:instrText xml:space="preserve"> PAGEREF _Toc231135575 \h </w:instrText>
         </w:r>
         <w:r>
           <w:rPr>
@@ -3892,7 +3895,7 @@
           <w14:ligatures w14:val="standardContextual"/>
         </w:rPr>
       </w:pPr>
-      <w:hyperlink w:anchor="_Toc231121750" w:history="1">
+      <w:hyperlink w:anchor="_Toc231135576" w:history="1">
         <w:r>
           <w:rPr>
             <w:rStyle w:val="Hipervnculo"/>
@@ -3919,7 +3922,7 @@
             <w:noProof/>
             <w:webHidden/>
           </w:rPr>
-          <w:instrText xml:space="preserve"> PAGEREF _Toc231121750 \h </w:instrText>
+          <w:instrText xml:space="preserve"> PAGEREF _Toc231135576 \h </w:instrText>
         </w:r>
         <w:r>
           <w:rPr>
@@ -3966,7 +3969,7 @@
           <w14:ligatures w14:val="standardContextual"/>
         </w:rPr>
       </w:pPr>
-      <w:hyperlink w:anchor="_Toc231121751" w:history="1">
+      <w:hyperlink w:anchor="_Toc231135577" w:history="1">
         <w:r>
           <w:rPr>
             <w:rStyle w:val="Hipervnculo"/>
@@ -3993,7 +3996,7 @@
             <w:noProof/>
             <w:webHidden/>
           </w:rPr>
-          <w:instrText xml:space="preserve"> PAGEREF _Toc231121751 \h </w:instrText>
+          <w:instrText xml:space="preserve"> PAGEREF _Toc231135577 \h </w:instrText>
         </w:r>
         <w:r>
           <w:rPr>
@@ -4040,7 +4043,7 @@
           <w14:ligatures w14:val="standardContextual"/>
         </w:rPr>
       </w:pPr>
-      <w:hyperlink w:anchor="_Toc231121752" w:history="1">
+      <w:hyperlink w:anchor="_Toc231135578" w:history="1">
         <w:r>
           <w:rPr>
             <w:rStyle w:val="Hipervnculo"/>
@@ -4067,7 +4070,7 @@
             <w:noProof/>
             <w:webHidden/>
           </w:rPr>
-          <w:instrText xml:space="preserve"> PAGEREF _Toc231121752 \h </w:instrText>
+          <w:instrText xml:space="preserve"> PAGEREF _Toc231135578 \h </w:instrText>
         </w:r>
         <w:r>
           <w:rPr>
@@ -4114,7 +4117,7 @@
           <w14:ligatures w14:val="standardContextual"/>
         </w:rPr>
       </w:pPr>
-      <w:hyperlink w:anchor="_Toc231121753" w:history="1">
+      <w:hyperlink w:anchor="_Toc231135579" w:history="1">
         <w:r>
           <w:rPr>
             <w:rStyle w:val="Hipervnculo"/>
@@ -4141,7 +4144,7 @@
             <w:noProof/>
             <w:webHidden/>
           </w:rPr>
-          <w:instrText xml:space="preserve"> PAGEREF _Toc231121753 \h </w:instrText>
+          <w:instrText xml:space="preserve"> PAGEREF _Toc231135579 \h </w:instrText>
         </w:r>
         <w:r>
           <w:rPr>
@@ -4188,7 +4191,7 @@
           <w14:ligatures w14:val="standardContextual"/>
         </w:rPr>
       </w:pPr>
-      <w:hyperlink w:anchor="_Toc231121754" w:history="1">
+      <w:hyperlink w:anchor="_Toc231135580" w:history="1">
         <w:r>
           <w:rPr>
             <w:rStyle w:val="Hipervnculo"/>
@@ -4215,7 +4218,7 @@
             <w:noProof/>
             <w:webHidden/>
           </w:rPr>
-          <w:instrText xml:space="preserve"> PAGEREF _Toc231121754 \h </w:instrText>
+          <w:instrText xml:space="preserve"> PAGEREF _Toc231135580 \h </w:instrText>
         </w:r>
         <w:r>
           <w:rPr>
@@ -4262,7 +4265,7 @@
           <w14:ligatures w14:val="standardContextual"/>
         </w:rPr>
       </w:pPr>
-      <w:hyperlink w:anchor="_Toc231121755" w:history="1">
+      <w:hyperlink w:anchor="_Toc231135581" w:history="1">
         <w:r>
           <w:rPr>
             <w:rStyle w:val="Hipervnculo"/>
@@ -4289,7 +4292,7 @@
             <w:noProof/>
             <w:webHidden/>
           </w:rPr>
-          <w:instrText xml:space="preserve"> PAGEREF _Toc231121755 \h </w:instrText>
+          <w:instrText xml:space="preserve"> PAGEREF _Toc231135581 \h </w:instrText>
         </w:r>
         <w:r>
           <w:rPr>
@@ -4336,7 +4339,7 @@
           <w14:ligatures w14:val="standardContextual"/>
         </w:rPr>
       </w:pPr>
-      <w:hyperlink w:anchor="_Toc231121756" w:history="1">
+      <w:hyperlink w:anchor="_Toc231135582" w:history="1">
         <w:r>
           <w:rPr>
             <w:rStyle w:val="Hipervnculo"/>
@@ -4363,7 +4366,7 @@
             <w:noProof/>
             <w:webHidden/>
           </w:rPr>
-          <w:instrText xml:space="preserve"> PAGEREF _Toc231121756 \h </w:instrText>
+          <w:instrText xml:space="preserve"> PAGEREF _Toc231135582 \h </w:instrText>
         </w:r>
         <w:r>
           <w:rPr>
@@ -4410,7 +4413,7 @@
           <w14:ligatures w14:val="standardContextual"/>
         </w:rPr>
       </w:pPr>
-      <w:hyperlink w:anchor="_Toc231121757" w:history="1">
+      <w:hyperlink w:anchor="_Toc231135583" w:history="1">
         <w:r>
           <w:rPr>
             <w:rStyle w:val="Hipervnculo"/>
@@ -4437,7 +4440,7 @@
             <w:noProof/>
             <w:webHidden/>
           </w:rPr>
-          <w:instrText xml:space="preserve"> PAGEREF _Toc231121757 \h </w:instrText>
+          <w:instrText xml:space="preserve"> PAGEREF _Toc231135583 \h </w:instrText>
         </w:r>
         <w:r>
           <w:rPr>
@@ -4484,7 +4487,7 @@
           <w14:ligatures w14:val="standardContextual"/>
         </w:rPr>
       </w:pPr>
-      <w:hyperlink w:anchor="_Toc231121758" w:history="1">
+      <w:hyperlink w:anchor="_Toc231135584" w:history="1">
         <w:r>
           <w:rPr>
             <w:rStyle w:val="Hipervnculo"/>
@@ -4511,7 +4514,7 @@
             <w:noProof/>
             <w:webHidden/>
           </w:rPr>
-          <w:instrText xml:space="preserve"> PAGEREF _Toc231121758 \h </w:instrText>
+          <w:instrText xml:space="preserve"> PAGEREF _Toc231135584 \h </w:instrText>
         </w:r>
         <w:r>
           <w:rPr>
@@ -4558,7 +4561,7 @@
           <w14:ligatures w14:val="standardContextual"/>
         </w:rPr>
       </w:pPr>
-      <w:hyperlink w:anchor="_Toc231121759" w:history="1">
+      <w:hyperlink w:anchor="_Toc231135585" w:history="1">
         <w:r>
           <w:rPr>
             <w:rStyle w:val="Hipervnculo"/>
@@ -4585,7 +4588,7 @@
             <w:noProof/>
             <w:webHidden/>
           </w:rPr>
-          <w:instrText xml:space="preserve"> PAGEREF _Toc231121759 \h </w:instrText>
+          <w:instrText xml:space="preserve"> PAGEREF _Toc231135585 \h </w:instrText>
         </w:r>
         <w:r>
           <w:rPr>
@@ -4632,7 +4635,7 @@
           <w14:ligatures w14:val="standardContextual"/>
         </w:rPr>
       </w:pPr>
-      <w:hyperlink w:anchor="_Toc231121760" w:history="1">
+      <w:hyperlink w:anchor="_Toc231135586" w:history="1">
         <w:r>
           <w:rPr>
             <w:rStyle w:val="Hipervnculo"/>
@@ -4659,7 +4662,7 @@
             <w:noProof/>
             <w:webHidden/>
           </w:rPr>
-          <w:instrText xml:space="preserve"> PAGEREF _Toc231121760 \h </w:instrText>
+          <w:instrText xml:space="preserve"> PAGEREF _Toc231135586 \h </w:instrText>
         </w:r>
         <w:r>
           <w:rPr>
@@ -4706,7 +4709,7 @@
           <w14:ligatures w14:val="standardContextual"/>
         </w:rPr>
       </w:pPr>
-      <w:hyperlink w:anchor="_Toc231121761" w:history="1">
+      <w:hyperlink w:anchor="_Toc231135587" w:history="1">
         <w:r>
           <w:rPr>
             <w:rStyle w:val="Hipervnculo"/>
@@ -4733,7 +4736,7 @@
             <w:noProof/>
             <w:webHidden/>
           </w:rPr>
-          <w:instrText xml:space="preserve"> PAGEREF _Toc231121761 \h </w:instrText>
+          <w:instrText xml:space="preserve"> PAGEREF _Toc231135587 \h </w:instrText>
         </w:r>
         <w:r>
           <w:rPr>
@@ -4780,7 +4783,7 @@
           <w14:ligatures w14:val="standardContextual"/>
         </w:rPr>
       </w:pPr>
-      <w:hyperlink w:anchor="_Toc231121762" w:history="1">
+      <w:hyperlink w:anchor="_Toc231135588" w:history="1">
         <w:r>
           <w:rPr>
             <w:rStyle w:val="Hipervnculo"/>
@@ -4807,7 +4810,7 @@
             <w:noProof/>
             <w:webHidden/>
           </w:rPr>
-          <w:instrText xml:space="preserve"> PAGEREF _Toc231121762 \h </w:instrText>
+          <w:instrText xml:space="preserve"> PAGEREF _Toc231135588 \h </w:instrText>
         </w:r>
         <w:r>
           <w:rPr>
@@ -4854,7 +4857,7 @@
           <w14:ligatures w14:val="standardContextual"/>
         </w:rPr>
       </w:pPr>
-      <w:hyperlink w:anchor="_Toc231121763" w:history="1">
+      <w:hyperlink w:anchor="_Toc231135589" w:history="1">
         <w:r>
           <w:rPr>
             <w:rStyle w:val="Hipervnculo"/>
@@ -4881,7 +4884,7 @@
             <w:noProof/>
             <w:webHidden/>
           </w:rPr>
-          <w:instrText xml:space="preserve"> PAGEREF _Toc231121763 \h </w:instrText>
+          <w:instrText xml:space="preserve"> PAGEREF _Toc231135589 \h </w:instrText>
         </w:r>
         <w:r>
           <w:rPr>
@@ -4928,7 +4931,7 @@
           <w14:ligatures w14:val="standardContextual"/>
         </w:rPr>
       </w:pPr>
-      <w:hyperlink w:anchor="_Toc231121764" w:history="1">
+      <w:hyperlink w:anchor="_Toc231135590" w:history="1">
         <w:r>
           <w:rPr>
             <w:rStyle w:val="Hipervnculo"/>
@@ -4955,7 +4958,7 @@
             <w:noProof/>
             <w:webHidden/>
           </w:rPr>
-          <w:instrText xml:space="preserve"> PAGEREF _Toc231121764 \h </w:instrText>
+          <w:instrText xml:space="preserve"> PAGEREF _Toc231135590 \h </w:instrText>
         </w:r>
         <w:r>
           <w:rPr>
@@ -5002,7 +5005,7 @@
           <w14:ligatures w14:val="standardContextual"/>
         </w:rPr>
       </w:pPr>
-      <w:hyperlink w:anchor="_Toc231121765" w:history="1">
+      <w:hyperlink w:anchor="_Toc231135591" w:history="1">
         <w:r>
           <w:rPr>
             <w:rStyle w:val="Hipervnculo"/>
@@ -5029,7 +5032,7 @@
             <w:noProof/>
             <w:webHidden/>
           </w:rPr>
-          <w:instrText xml:space="preserve"> PAGEREF _Toc231121765 \h </w:instrText>
+          <w:instrText xml:space="preserve"> PAGEREF _Toc231135591 \h </w:instrText>
         </w:r>
         <w:r>
           <w:rPr>
@@ -5085,7 +5088,7 @@
       <w:pPr>
         <w:pStyle w:val="Ttulo1"/>
       </w:pPr>
-      <w:bookmarkStart w:id="7" w:name="_Toc231121714"/>
+      <w:bookmarkStart w:id="7" w:name="_Toc231135540"/>
       <w:r>
         <w:lastRenderedPageBreak/>
         <w:t>Índice de tablas</w:t>
@@ -5117,7 +5120,7 @@
       <w:r>
         <w:fldChar w:fldCharType="separate"/>
       </w:r>
-      <w:hyperlink w:anchor="_Toc231121766" w:history="1">
+      <w:hyperlink w:anchor="_Toc231135592" w:history="1">
         <w:r>
           <w:rPr>
             <w:rStyle w:val="Hipervnculo"/>
@@ -5144,7 +5147,7 @@
             <w:noProof/>
             <w:webHidden/>
           </w:rPr>
-          <w:instrText xml:space="preserve"> PAGEREF _Toc231121766 \h </w:instrText>
+          <w:instrText xml:space="preserve"> PAGEREF _Toc231135592 \h </w:instrText>
         </w:r>
         <w:r>
           <w:rPr>
@@ -5191,7 +5194,7 @@
           <w14:ligatures w14:val="standardContextual"/>
         </w:rPr>
       </w:pPr>
-      <w:hyperlink w:anchor="_Toc231121767" w:history="1">
+      <w:hyperlink w:anchor="_Toc231135593" w:history="1">
         <w:r>
           <w:rPr>
             <w:rStyle w:val="Hipervnculo"/>
@@ -5218,7 +5221,7 @@
             <w:noProof/>
             <w:webHidden/>
           </w:rPr>
-          <w:instrText xml:space="preserve"> PAGEREF _Toc231121767 \h </w:instrText>
+          <w:instrText xml:space="preserve"> PAGEREF _Toc231135593 \h </w:instrText>
         </w:r>
         <w:r>
           <w:rPr>
@@ -5265,7 +5268,7 @@
           <w14:ligatures w14:val="standardContextual"/>
         </w:rPr>
       </w:pPr>
-      <w:hyperlink w:anchor="_Toc231121768" w:history="1">
+      <w:hyperlink w:anchor="_Toc231135594" w:history="1">
         <w:r>
           <w:rPr>
             <w:rStyle w:val="Hipervnculo"/>
@@ -5292,7 +5295,7 @@
             <w:noProof/>
             <w:webHidden/>
           </w:rPr>
-          <w:instrText xml:space="preserve"> PAGEREF _Toc231121768 \h </w:instrText>
+          <w:instrText xml:space="preserve"> PAGEREF _Toc231135594 \h </w:instrText>
         </w:r>
         <w:r>
           <w:rPr>
@@ -5339,7 +5342,7 @@
           <w14:ligatures w14:val="standardContextual"/>
         </w:rPr>
       </w:pPr>
-      <w:hyperlink w:anchor="_Toc231121769" w:history="1">
+      <w:hyperlink w:anchor="_Toc231135595" w:history="1">
         <w:r>
           <w:rPr>
             <w:rStyle w:val="Hipervnculo"/>
@@ -5366,7 +5369,7 @@
             <w:noProof/>
             <w:webHidden/>
           </w:rPr>
-          <w:instrText xml:space="preserve"> PAGEREF _Toc231121769 \h </w:instrText>
+          <w:instrText xml:space="preserve"> PAGEREF _Toc231135595 \h </w:instrText>
         </w:r>
         <w:r>
           <w:rPr>
@@ -5413,7 +5416,7 @@
           <w14:ligatures w14:val="standardContextual"/>
         </w:rPr>
       </w:pPr>
-      <w:hyperlink w:anchor="_Toc231121770" w:history="1">
+      <w:hyperlink w:anchor="_Toc231135596" w:history="1">
         <w:r>
           <w:rPr>
             <w:rStyle w:val="Hipervnculo"/>
@@ -5440,7 +5443,7 @@
             <w:noProof/>
             <w:webHidden/>
           </w:rPr>
-          <w:instrText xml:space="preserve"> PAGEREF _Toc231121770 \h </w:instrText>
+          <w:instrText xml:space="preserve"> PAGEREF _Toc231135596 \h </w:instrText>
         </w:r>
         <w:r>
           <w:rPr>
@@ -5487,7 +5490,7 @@
           <w14:ligatures w14:val="standardContextual"/>
         </w:rPr>
       </w:pPr>
-      <w:hyperlink w:anchor="_Toc231121771" w:history="1">
+      <w:hyperlink w:anchor="_Toc231135597" w:history="1">
         <w:r>
           <w:rPr>
             <w:rStyle w:val="Hipervnculo"/>
@@ -5514,7 +5517,7 @@
             <w:noProof/>
             <w:webHidden/>
           </w:rPr>
-          <w:instrText xml:space="preserve"> PAGEREF _Toc231121771 \h </w:instrText>
+          <w:instrText xml:space="preserve"> PAGEREF _Toc231135597 \h </w:instrText>
         </w:r>
         <w:r>
           <w:rPr>
@@ -5561,7 +5564,7 @@
           <w14:ligatures w14:val="standardContextual"/>
         </w:rPr>
       </w:pPr>
-      <w:hyperlink w:anchor="_Toc231121772" w:history="1">
+      <w:hyperlink w:anchor="_Toc231135598" w:history="1">
         <w:r>
           <w:rPr>
             <w:rStyle w:val="Hipervnculo"/>
@@ -5588,7 +5591,7 @@
             <w:noProof/>
             <w:webHidden/>
           </w:rPr>
-          <w:instrText xml:space="preserve"> PAGEREF _Toc231121772 \h </w:instrText>
+          <w:instrText xml:space="preserve"> PAGEREF _Toc231135598 \h </w:instrText>
         </w:r>
         <w:r>
           <w:rPr>
@@ -5635,7 +5638,7 @@
           <w14:ligatures w14:val="standardContextual"/>
         </w:rPr>
       </w:pPr>
-      <w:hyperlink w:anchor="_Toc231121773" w:history="1">
+      <w:hyperlink w:anchor="_Toc231135599" w:history="1">
         <w:r>
           <w:rPr>
             <w:rStyle w:val="Hipervnculo"/>
@@ -5662,7 +5665,7 @@
             <w:noProof/>
             <w:webHidden/>
           </w:rPr>
-          <w:instrText xml:space="preserve"> PAGEREF _Toc231121773 \h </w:instrText>
+          <w:instrText xml:space="preserve"> PAGEREF _Toc231135599 \h </w:instrText>
         </w:r>
         <w:r>
           <w:rPr>
@@ -5709,7 +5712,7 @@
           <w14:ligatures w14:val="standardContextual"/>
         </w:rPr>
       </w:pPr>
-      <w:hyperlink w:anchor="_Toc231121774" w:history="1">
+      <w:hyperlink w:anchor="_Toc231135600" w:history="1">
         <w:r>
           <w:rPr>
             <w:rStyle w:val="Hipervnculo"/>
@@ -5736,7 +5739,7 @@
             <w:noProof/>
             <w:webHidden/>
           </w:rPr>
-          <w:instrText xml:space="preserve"> PAGEREF _Toc231121774 \h </w:instrText>
+          <w:instrText xml:space="preserve"> PAGEREF _Toc231135600 \h </w:instrText>
         </w:r>
         <w:r>
           <w:rPr>
@@ -5783,7 +5786,7 @@
           <w14:ligatures w14:val="standardContextual"/>
         </w:rPr>
       </w:pPr>
-      <w:hyperlink w:anchor="_Toc231121775" w:history="1">
+      <w:hyperlink w:anchor="_Toc231135601" w:history="1">
         <w:r>
           <w:rPr>
             <w:rStyle w:val="Hipervnculo"/>
@@ -5810,7 +5813,7 @@
             <w:noProof/>
             <w:webHidden/>
           </w:rPr>
-          <w:instrText xml:space="preserve"> PAGEREF _Toc231121775 \h </w:instrText>
+          <w:instrText xml:space="preserve"> PAGEREF _Toc231135601 \h </w:instrText>
         </w:r>
         <w:r>
           <w:rPr>
@@ -5857,7 +5860,7 @@
           <w14:ligatures w14:val="standardContextual"/>
         </w:rPr>
       </w:pPr>
-      <w:hyperlink w:anchor="_Toc231121776" w:history="1">
+      <w:hyperlink w:anchor="_Toc231135602" w:history="1">
         <w:r>
           <w:rPr>
             <w:rStyle w:val="Hipervnculo"/>
@@ -5884,7 +5887,7 @@
             <w:noProof/>
             <w:webHidden/>
           </w:rPr>
-          <w:instrText xml:space="preserve"> PAGEREF _Toc231121776 \h </w:instrText>
+          <w:instrText xml:space="preserve"> PAGEREF _Toc231135602 \h </w:instrText>
         </w:r>
         <w:r>
           <w:rPr>
@@ -5931,7 +5934,7 @@
           <w14:ligatures w14:val="standardContextual"/>
         </w:rPr>
       </w:pPr>
-      <w:hyperlink w:anchor="_Toc231121777" w:history="1">
+      <w:hyperlink w:anchor="_Toc231135603" w:history="1">
         <w:r>
           <w:rPr>
             <w:rStyle w:val="Hipervnculo"/>
@@ -5958,7 +5961,7 @@
             <w:noProof/>
             <w:webHidden/>
           </w:rPr>
-          <w:instrText xml:space="preserve"> PAGEREF _Toc231121777 \h </w:instrText>
+          <w:instrText xml:space="preserve"> PAGEREF _Toc231135603 \h </w:instrText>
         </w:r>
         <w:r>
           <w:rPr>
@@ -6005,7 +6008,7 @@
           <w14:ligatures w14:val="standardContextual"/>
         </w:rPr>
       </w:pPr>
-      <w:hyperlink w:anchor="_Toc231121778" w:history="1">
+      <w:hyperlink w:anchor="_Toc231135604" w:history="1">
         <w:r>
           <w:rPr>
             <w:rStyle w:val="Hipervnculo"/>
@@ -6032,7 +6035,7 @@
             <w:noProof/>
             <w:webHidden/>
           </w:rPr>
-          <w:instrText xml:space="preserve"> PAGEREF _Toc231121778 \h </w:instrText>
+          <w:instrText xml:space="preserve"> PAGEREF _Toc231135604 \h </w:instrText>
         </w:r>
         <w:r>
           <w:rPr>
@@ -6079,7 +6082,7 @@
           <w14:ligatures w14:val="standardContextual"/>
         </w:rPr>
       </w:pPr>
-      <w:hyperlink w:anchor="_Toc231121779" w:history="1">
+      <w:hyperlink w:anchor="_Toc231135605" w:history="1">
         <w:r>
           <w:rPr>
             <w:rStyle w:val="Hipervnculo"/>
@@ -6106,7 +6109,7 @@
             <w:noProof/>
             <w:webHidden/>
           </w:rPr>
-          <w:instrText xml:space="preserve"> PAGEREF _Toc231121779 \h </w:instrText>
+          <w:instrText xml:space="preserve"> PAGEREF _Toc231135605 \h </w:instrText>
         </w:r>
         <w:r>
           <w:rPr>
@@ -6162,7 +6165,7 @@
       <w:pPr>
         <w:pStyle w:val="Ttulo1"/>
       </w:pPr>
-      <w:bookmarkStart w:id="8" w:name="_Toc231121715"/>
+      <w:bookmarkStart w:id="8" w:name="_Toc231135541"/>
       <w:r>
         <w:lastRenderedPageBreak/>
         <w:t>Índice de figuras</w:t>
@@ -6194,7 +6197,7 @@
       <w:r>
         <w:fldChar w:fldCharType="separate"/>
       </w:r>
-      <w:hyperlink w:anchor="_Toc231121780" w:history="1">
+      <w:hyperlink w:anchor="_Toc231135606" w:history="1">
         <w:r>
           <w:rPr>
             <w:rStyle w:val="Hipervnculo"/>
@@ -6221,7 +6224,7 @@
             <w:noProof/>
             <w:webHidden/>
           </w:rPr>
-          <w:instrText xml:space="preserve"> PAGEREF _Toc231121780 \h </w:instrText>
+          <w:instrText xml:space="preserve"> PAGEREF _Toc231135606 \h </w:instrText>
         </w:r>
         <w:r>
           <w:rPr>
@@ -6268,7 +6271,7 @@
           <w14:ligatures w14:val="standardContextual"/>
         </w:rPr>
       </w:pPr>
-      <w:hyperlink w:anchor="_Toc231121781" w:history="1">
+      <w:hyperlink w:anchor="_Toc231135607" w:history="1">
         <w:r>
           <w:rPr>
             <w:rStyle w:val="Hipervnculo"/>
@@ -6295,7 +6298,7 @@
             <w:noProof/>
             <w:webHidden/>
           </w:rPr>
-          <w:instrText xml:space="preserve"> PAGEREF _Toc231121781 \h </w:instrText>
+          <w:instrText xml:space="preserve"> PAGEREF _Toc231135607 \h </w:instrText>
         </w:r>
         <w:r>
           <w:rPr>
@@ -6342,7 +6345,7 @@
           <w14:ligatures w14:val="standardContextual"/>
         </w:rPr>
       </w:pPr>
-      <w:hyperlink w:anchor="_Toc231121782" w:history="1">
+      <w:hyperlink w:anchor="_Toc231135608" w:history="1">
         <w:r>
           <w:rPr>
             <w:rStyle w:val="Hipervnculo"/>
@@ -6369,7 +6372,7 @@
             <w:noProof/>
             <w:webHidden/>
           </w:rPr>
-          <w:instrText xml:space="preserve"> PAGEREF _Toc231121782 \h </w:instrText>
+          <w:instrText xml:space="preserve"> PAGEREF _Toc231135608 \h </w:instrText>
         </w:r>
         <w:r>
           <w:rPr>
@@ -6416,7 +6419,7 @@
           <w14:ligatures w14:val="standardContextual"/>
         </w:rPr>
       </w:pPr>
-      <w:hyperlink w:anchor="_Toc231121783" w:history="1">
+      <w:hyperlink w:anchor="_Toc231135609" w:history="1">
         <w:r>
           <w:rPr>
             <w:rStyle w:val="Hipervnculo"/>
@@ -6443,7 +6446,7 @@
             <w:noProof/>
             <w:webHidden/>
           </w:rPr>
-          <w:instrText xml:space="preserve"> PAGEREF _Toc231121783 \h </w:instrText>
+          <w:instrText xml:space="preserve"> PAGEREF _Toc231135609 \h </w:instrText>
         </w:r>
         <w:r>
           <w:rPr>
@@ -6490,7 +6493,7 @@
           <w14:ligatures w14:val="standardContextual"/>
         </w:rPr>
       </w:pPr>
-      <w:hyperlink w:anchor="_Toc231121784" w:history="1">
+      <w:hyperlink w:anchor="_Toc231135610" w:history="1">
         <w:r>
           <w:rPr>
             <w:rStyle w:val="Hipervnculo"/>
@@ -6517,7 +6520,7 @@
             <w:noProof/>
             <w:webHidden/>
           </w:rPr>
-          <w:instrText xml:space="preserve"> PAGEREF _Toc231121784 \h </w:instrText>
+          <w:instrText xml:space="preserve"> PAGEREF _Toc231135610 \h </w:instrText>
         </w:r>
         <w:r>
           <w:rPr>
@@ -6564,7 +6567,7 @@
           <w14:ligatures w14:val="standardContextual"/>
         </w:rPr>
       </w:pPr>
-      <w:hyperlink w:anchor="_Toc231121785" w:history="1">
+      <w:hyperlink w:anchor="_Toc231135611" w:history="1">
         <w:r>
           <w:rPr>
             <w:rStyle w:val="Hipervnculo"/>
@@ -6591,7 +6594,7 @@
             <w:noProof/>
             <w:webHidden/>
           </w:rPr>
-          <w:instrText xml:space="preserve"> PAGEREF _Toc231121785 \h </w:instrText>
+          <w:instrText xml:space="preserve"> PAGEREF _Toc231135611 \h </w:instrText>
         </w:r>
         <w:r>
           <w:rPr>
@@ -6638,7 +6641,7 @@
           <w14:ligatures w14:val="standardContextual"/>
         </w:rPr>
       </w:pPr>
-      <w:hyperlink w:anchor="_Toc231121786" w:history="1">
+      <w:hyperlink w:anchor="_Toc231135612" w:history="1">
         <w:r>
           <w:rPr>
             <w:rStyle w:val="Hipervnculo"/>
@@ -6665,7 +6668,7 @@
             <w:noProof/>
             <w:webHidden/>
           </w:rPr>
-          <w:instrText xml:space="preserve"> PAGEREF _Toc231121786 \h </w:instrText>
+          <w:instrText xml:space="preserve"> PAGEREF _Toc231135612 \h </w:instrText>
         </w:r>
         <w:r>
           <w:rPr>
@@ -6712,7 +6715,7 @@
           <w14:ligatures w14:val="standardContextual"/>
         </w:rPr>
       </w:pPr>
-      <w:hyperlink w:anchor="_Toc231121787" w:history="1">
+      <w:hyperlink w:anchor="_Toc231135613" w:history="1">
         <w:r>
           <w:rPr>
             <w:rStyle w:val="Hipervnculo"/>
@@ -6739,7 +6742,7 @@
             <w:noProof/>
             <w:webHidden/>
           </w:rPr>
-          <w:instrText xml:space="preserve"> PAGEREF _Toc231121787 \h </w:instrText>
+          <w:instrText xml:space="preserve"> PAGEREF _Toc231135613 \h </w:instrText>
         </w:r>
         <w:r>
           <w:rPr>
@@ -6786,7 +6789,7 @@
           <w14:ligatures w14:val="standardContextual"/>
         </w:rPr>
       </w:pPr>
-      <w:hyperlink w:anchor="_Toc231121788" w:history="1">
+      <w:hyperlink w:anchor="_Toc231135614" w:history="1">
         <w:r>
           <w:rPr>
             <w:rStyle w:val="Hipervnculo"/>
@@ -6813,7 +6816,7 @@
             <w:noProof/>
             <w:webHidden/>
           </w:rPr>
-          <w:instrText xml:space="preserve"> PAGEREF _Toc231121788 \h </w:instrText>
+          <w:instrText xml:space="preserve"> PAGEREF _Toc231135614 \h </w:instrText>
         </w:r>
         <w:r>
           <w:rPr>
@@ -6869,7 +6872,7 @@
       <w:pPr>
         <w:pStyle w:val="Ttulo1"/>
       </w:pPr>
-      <w:bookmarkStart w:id="9" w:name="_Toc231121716"/>
+      <w:bookmarkStart w:id="9" w:name="_Toc231135542"/>
       <w:r>
         <w:lastRenderedPageBreak/>
         <w:t>Lista de abreviaturas y siglas</w:t>
@@ -7831,7 +7834,7 @@
       <w:pPr>
         <w:pStyle w:val="Ttulo1"/>
       </w:pPr>
-      <w:bookmarkStart w:id="10" w:name="_Toc231121717"/>
+      <w:bookmarkStart w:id="10" w:name="_Toc231135543"/>
       <w:r>
         <w:lastRenderedPageBreak/>
         <w:t>Lista de símbolos</w:t>
@@ -8461,7 +8464,7 @@
       <w:pPr>
         <w:pStyle w:val="Ttulo1"/>
       </w:pPr>
-      <w:bookmarkStart w:id="11" w:name="_Toc231121718"/>
+      <w:bookmarkStart w:id="11" w:name="_Toc231135544"/>
       <w:r>
         <w:lastRenderedPageBreak/>
         <w:t xml:space="preserve">I. </w:t>
@@ -8475,7 +8478,7 @@
       <w:pPr>
         <w:pStyle w:val="Ttulo2"/>
       </w:pPr>
-      <w:bookmarkStart w:id="12" w:name="_Toc231121719"/>
+      <w:bookmarkStart w:id="12" w:name="_Toc231135545"/>
       <w:r>
         <w:t>1.1 Realidad Problemática</w:t>
       </w:r>
@@ -8587,7 +8590,7 @@
       <w:pPr>
         <w:pStyle w:val="Ttulo3"/>
       </w:pPr>
-      <w:bookmarkStart w:id="13" w:name="_Toc231121720"/>
+      <w:bookmarkStart w:id="13" w:name="_Toc231135546"/>
       <w:r>
         <w:t>1.2.1 Antecedentes internacionales</w:t>
       </w:r>
@@ -8690,7 +8693,7 @@
       <w:pPr>
         <w:pStyle w:val="Ttulo3"/>
       </w:pPr>
-      <w:bookmarkStart w:id="14" w:name="_Toc231121721"/>
+      <w:bookmarkStart w:id="14" w:name="_Toc231135547"/>
       <w:r>
         <w:t>1.2.2 Antecedentes nacionales y regionales</w:t>
       </w:r>
@@ -8749,7 +8752,7 @@
       <w:pPr>
         <w:pStyle w:val="Ttulo2"/>
       </w:pPr>
-      <w:bookmarkStart w:id="15" w:name="_Toc231121722"/>
+      <w:bookmarkStart w:id="15" w:name="_Toc231135548"/>
       <w:r>
         <w:lastRenderedPageBreak/>
         <w:t>1.3 Teorías relacionadas al tema</w:t>
@@ -9022,7 +9025,7 @@
       <w:pPr>
         <w:pStyle w:val="Ttulo2"/>
       </w:pPr>
-      <w:bookmarkStart w:id="16" w:name="_Toc231121723"/>
+      <w:bookmarkStart w:id="16" w:name="_Toc231135549"/>
       <w:r>
         <w:t>1.4 Formulación del Problema</w:t>
       </w:r>
@@ -9138,7 +9141,7 @@
       <w:pPr>
         <w:pStyle w:val="Ttulo2"/>
       </w:pPr>
-      <w:bookmarkStart w:id="17" w:name="_Toc231121724"/>
+      <w:bookmarkStart w:id="17" w:name="_Toc231135550"/>
       <w:r>
         <w:t>1.5 Justificación e importancia del estudio</w:t>
       </w:r>
@@ -9256,7 +9259,7 @@
       <w:pPr>
         <w:pStyle w:val="Ttulo2"/>
       </w:pPr>
-      <w:bookmarkStart w:id="18" w:name="_Toc231121725"/>
+      <w:bookmarkStart w:id="18" w:name="_Toc231135551"/>
       <w:r>
         <w:t>1.6 Hipótesis</w:t>
       </w:r>
@@ -9436,7 +9439,7 @@
       <w:pPr>
         <w:pStyle w:val="Ttulo2"/>
       </w:pPr>
-      <w:bookmarkStart w:id="19" w:name="_Toc231121726"/>
+      <w:bookmarkStart w:id="19" w:name="_Toc231135552"/>
       <w:r>
         <w:t>1.7 Objetivos</w:t>
       </w:r>
@@ -9446,7 +9449,7 @@
       <w:pPr>
         <w:pStyle w:val="Ttulo3"/>
       </w:pPr>
-      <w:bookmarkStart w:id="20" w:name="_Toc231121727"/>
+      <w:bookmarkStart w:id="20" w:name="_Toc231135553"/>
       <w:r>
         <w:t>1.7.1 Objetivo General</w:t>
       </w:r>
@@ -9466,7 +9469,7 @@
       <w:pPr>
         <w:pStyle w:val="Ttulo3"/>
       </w:pPr>
-      <w:bookmarkStart w:id="21" w:name="_Toc231121728"/>
+      <w:bookmarkStart w:id="21" w:name="_Toc231135554"/>
       <w:r>
         <w:t>1.7.2 Objetivos específicos</w:t>
       </w:r>
@@ -9553,7 +9556,7 @@
       <w:pPr>
         <w:pStyle w:val="Ttulo1"/>
       </w:pPr>
-      <w:bookmarkStart w:id="22" w:name="_Toc231121729"/>
+      <w:bookmarkStart w:id="22" w:name="_Toc231135555"/>
       <w:r>
         <w:lastRenderedPageBreak/>
         <w:t>II. MATERIAL Y MÉTODO</w:t>
@@ -9564,7 +9567,7 @@
       <w:pPr>
         <w:pStyle w:val="Ttulo2"/>
       </w:pPr>
-      <w:bookmarkStart w:id="23" w:name="_Toc231121730"/>
+      <w:bookmarkStart w:id="23" w:name="_Toc231135556"/>
       <w:r>
         <w:t>2.1 Tipo y Diseño de Investigación</w:t>
       </w:r>
@@ -9696,7 +9699,7 @@
       <w:pPr>
         <w:pStyle w:val="Ttulo2"/>
       </w:pPr>
-      <w:bookmarkStart w:id="24" w:name="_Toc231121731"/>
+      <w:bookmarkStart w:id="24" w:name="_Toc231135557"/>
       <w:r>
         <w:lastRenderedPageBreak/>
         <w:t>2.2 Población, Muestra y Muestreo</w:t>
@@ -9819,7 +9822,7 @@
       <w:pPr>
         <w:pStyle w:val="Ttulo2"/>
       </w:pPr>
-      <w:bookmarkStart w:id="25" w:name="_Toc231121732"/>
+      <w:bookmarkStart w:id="25" w:name="_Toc231135558"/>
       <w:r>
         <w:t>2.3 Variables y Operacionalización</w:t>
       </w:r>
@@ -9936,7 +9939,7 @@
           <w:rFonts w:hint="eastAsia"/>
         </w:rPr>
       </w:pPr>
-      <w:bookmarkStart w:id="26" w:name="_Toc231121766"/>
+      <w:bookmarkStart w:id="26" w:name="_Toc231135592"/>
       <w:r>
         <w:rPr>
           <w:i w:val="0"/>
@@ -11247,7 +11250,7 @@
       <w:pPr>
         <w:pStyle w:val="Ttulo2"/>
       </w:pPr>
-      <w:bookmarkStart w:id="27" w:name="_Toc231121733"/>
+      <w:bookmarkStart w:id="27" w:name="_Toc231135559"/>
       <w:r>
         <w:lastRenderedPageBreak/>
         <w:t xml:space="preserve">2.4 Técnicas e </w:t>
@@ -11346,7 +11349,7 @@
       <w:pPr>
         <w:pStyle w:val="Ttulo2"/>
       </w:pPr>
-      <w:bookmarkStart w:id="28" w:name="_Toc231121734"/>
+      <w:bookmarkStart w:id="28" w:name="_Toc231135560"/>
       <w:r>
         <w:t>2.5 Procedimiento de análisis de datos</w:t>
       </w:r>
@@ -11620,7 +11623,7 @@
       <w:pPr>
         <w:pStyle w:val="Ttulo2"/>
       </w:pPr>
-      <w:bookmarkStart w:id="29" w:name="_Toc231121735"/>
+      <w:bookmarkStart w:id="29" w:name="_Toc231135561"/>
       <w:r>
         <w:lastRenderedPageBreak/>
         <w:t>2.6 Criterios éticos</w:t>
@@ -11680,7 +11683,7 @@
       <w:pPr>
         <w:pStyle w:val="Ttulo2"/>
       </w:pPr>
-      <w:bookmarkStart w:id="30" w:name="_Toc231121736"/>
+      <w:bookmarkStart w:id="30" w:name="_Toc231135562"/>
       <w:r>
         <w:t>2.7 Criterios de Rigor Científico</w:t>
       </w:r>
@@ -11750,7 +11753,7 @@
       <w:pPr>
         <w:pStyle w:val="Ttulo1"/>
       </w:pPr>
-      <w:bookmarkStart w:id="31" w:name="_Toc231121737"/>
+      <w:bookmarkStart w:id="31" w:name="_Toc231135563"/>
       <w:r>
         <w:lastRenderedPageBreak/>
         <w:t>III. RESULTADOS</w:t>
@@ -11761,7 +11764,7 @@
       <w:pPr>
         <w:pStyle w:val="Ttulo2"/>
       </w:pPr>
-      <w:bookmarkStart w:id="32" w:name="_Toc231121738"/>
+      <w:bookmarkStart w:id="32" w:name="_Toc231135564"/>
       <w:r>
         <w:t>3.1 Presentación de Resultados</w:t>
       </w:r>
@@ -11771,7 +11774,7 @@
       <w:pPr>
         <w:pStyle w:val="Ttulo3"/>
       </w:pPr>
-      <w:bookmarkStart w:id="33" w:name="_Toc231121739"/>
+      <w:bookmarkStart w:id="33" w:name="_Toc231135565"/>
       <w:r>
         <w:t>3.1.1 Análisis descriptivo y propiedades de las series</w:t>
       </w:r>
@@ -11800,7 +11803,7 @@
           <w:noProof/>
         </w:rPr>
         <w:drawing>
-          <wp:inline distT="0" distB="0" distL="0" distR="0" wp14:anchorId="5DC478B9" wp14:editId="555828F2">
+          <wp:inline distT="0" distB="0" distL="0" distR="0" wp14:anchorId="0EFDE55A" wp14:editId="3D5470C2">
             <wp:extent cx="5212080" cy="2886989"/>
             <wp:effectExtent l="0" t="0" r="0" b="0"/>
             <wp:docPr id="1" name="Picture 1"/>
@@ -11845,7 +11848,7 @@
           <w:rFonts w:hint="eastAsia"/>
         </w:rPr>
       </w:pPr>
-      <w:bookmarkStart w:id="34" w:name="_Toc231121780"/>
+      <w:bookmarkStart w:id="34" w:name="_Toc231135606"/>
       <w:r>
         <w:rPr>
           <w:i w:val="0"/>
@@ -11905,7 +11908,7 @@
         </w:rPr>
         <w:lastRenderedPageBreak/>
         <w:drawing>
-          <wp:inline distT="0" distB="0" distL="0" distR="0" wp14:anchorId="3227C0A7" wp14:editId="3A16A05C">
+          <wp:inline distT="0" distB="0" distL="0" distR="0" wp14:anchorId="6B768BC1" wp14:editId="3DDC5DAE">
             <wp:extent cx="5212080" cy="4441320"/>
             <wp:effectExtent l="0" t="0" r="0" b="0"/>
             <wp:docPr id="2" name="Picture 2"/>
@@ -11950,7 +11953,7 @@
           <w:rFonts w:hint="eastAsia"/>
         </w:rPr>
       </w:pPr>
-      <w:bookmarkStart w:id="35" w:name="_Toc231121781"/>
+      <w:bookmarkStart w:id="35" w:name="_Toc231135607"/>
       <w:r>
         <w:rPr>
           <w:i w:val="0"/>
@@ -12007,7 +12010,7 @@
       <w:pPr>
         <w:pStyle w:val="Ttulo3"/>
       </w:pPr>
-      <w:bookmarkStart w:id="36" w:name="_Toc231121740"/>
+      <w:bookmarkStart w:id="36" w:name="_Toc231135566"/>
       <w:r>
         <w:t>3.1.2 Determinantes de los retornos: factores globales y locales</w:t>
       </w:r>
@@ -12032,7 +12035,7 @@
           <w:rFonts w:hint="eastAsia"/>
         </w:rPr>
       </w:pPr>
-      <w:bookmarkStart w:id="37" w:name="_Toc231121767"/>
+      <w:bookmarkStart w:id="37" w:name="_Toc231135593"/>
       <w:r>
         <w:rPr>
           <w:i w:val="0"/>
@@ -12835,7 +12838,7 @@
         </w:rPr>
         <w:lastRenderedPageBreak/>
         <w:drawing>
-          <wp:inline distT="0" distB="0" distL="0" distR="0" wp14:anchorId="1112AD29" wp14:editId="1489B92A">
+          <wp:inline distT="0" distB="0" distL="0" distR="0" wp14:anchorId="4A02ABB6" wp14:editId="6382343D">
             <wp:extent cx="5212080" cy="2833680"/>
             <wp:effectExtent l="0" t="0" r="0" b="0"/>
             <wp:docPr id="3" name="Picture 3"/>
@@ -12880,7 +12883,7 @@
           <w:rFonts w:hint="eastAsia"/>
         </w:rPr>
       </w:pPr>
-      <w:bookmarkStart w:id="38" w:name="_Toc231121782"/>
+      <w:bookmarkStart w:id="38" w:name="_Toc231135608"/>
       <w:r>
         <w:rPr>
           <w:i w:val="0"/>
@@ -12920,7 +12923,7 @@
       <w:pPr>
         <w:pStyle w:val="Ttulo3"/>
       </w:pPr>
-      <w:bookmarkStart w:id="39" w:name="_Toc231121741"/>
+      <w:bookmarkStart w:id="39" w:name="_Toc231135567"/>
       <w:r>
         <w:t>3.1.3 Relaciones de largo plazo</w:t>
       </w:r>
@@ -12965,7 +12968,7 @@
       <w:pPr>
         <w:pStyle w:val="Ttulo3"/>
       </w:pPr>
-      <w:bookmarkStart w:id="40" w:name="_Toc231121742"/>
+      <w:bookmarkStart w:id="40" w:name="_Toc231135568"/>
       <w:r>
         <w:t>3.1.4 Dinámica de shocks</w:t>
       </w:r>
@@ -12998,7 +13001,7 @@
         </w:rPr>
         <w:lastRenderedPageBreak/>
         <w:drawing>
-          <wp:inline distT="0" distB="0" distL="0" distR="0" wp14:anchorId="02914DBD" wp14:editId="1B5FF818">
+          <wp:inline distT="0" distB="0" distL="0" distR="0" wp14:anchorId="151B012C" wp14:editId="4808B5DF">
             <wp:extent cx="5212080" cy="3890356"/>
             <wp:effectExtent l="0" t="0" r="0" b="0"/>
             <wp:docPr id="4" name="Picture 4"/>
@@ -13043,7 +13046,7 @@
           <w:rFonts w:hint="eastAsia"/>
         </w:rPr>
       </w:pPr>
-      <w:bookmarkStart w:id="41" w:name="_Toc231121783"/>
+      <w:bookmarkStart w:id="41" w:name="_Toc231135609"/>
       <w:r>
         <w:rPr>
           <w:i w:val="0"/>
@@ -13100,7 +13103,7 @@
         </w:rPr>
         <w:lastRenderedPageBreak/>
         <w:drawing>
-          <wp:inline distT="0" distB="0" distL="0" distR="0" wp14:anchorId="4BBD7F8C" wp14:editId="3FD2EBA3">
+          <wp:inline distT="0" distB="0" distL="0" distR="0" wp14:anchorId="11361165" wp14:editId="6245F9F3">
             <wp:extent cx="5212080" cy="2531582"/>
             <wp:effectExtent l="0" t="0" r="0" b="0"/>
             <wp:docPr id="5" name="Picture 5"/>
@@ -13145,7 +13148,7 @@
           <w:rFonts w:hint="eastAsia"/>
         </w:rPr>
       </w:pPr>
-      <w:bookmarkStart w:id="42" w:name="_Toc231121784"/>
+      <w:bookmarkStart w:id="42" w:name="_Toc231135610"/>
       <w:r>
         <w:rPr>
           <w:i w:val="0"/>
@@ -13182,7 +13185,7 @@
       <w:pPr>
         <w:pStyle w:val="Ttulo3"/>
       </w:pPr>
-      <w:bookmarkStart w:id="43" w:name="_Toc231121743"/>
+      <w:bookmarkStart w:id="43" w:name="_Toc231135569"/>
       <w:r>
         <w:t>3.1.5 Estabilidad por fases del ciclo</w:t>
       </w:r>
@@ -13224,7 +13227,7 @@
         </w:rPr>
         <w:lastRenderedPageBreak/>
         <w:drawing>
-          <wp:inline distT="0" distB="0" distL="0" distR="0" wp14:anchorId="19A69486" wp14:editId="269C9706">
+          <wp:inline distT="0" distB="0" distL="0" distR="0" wp14:anchorId="3192CA34" wp14:editId="6763E815">
             <wp:extent cx="5212080" cy="2366710"/>
             <wp:effectExtent l="0" t="0" r="0" b="0"/>
             <wp:docPr id="6" name="Picture 6"/>
@@ -13269,7 +13272,7 @@
           <w:rFonts w:hint="eastAsia"/>
         </w:rPr>
       </w:pPr>
-      <w:bookmarkStart w:id="44" w:name="_Toc231121785"/>
+      <w:bookmarkStart w:id="44" w:name="_Toc231135611"/>
       <w:r>
         <w:rPr>
           <w:i w:val="0"/>
@@ -13306,7 +13309,7 @@
       <w:pPr>
         <w:pStyle w:val="Ttulo3"/>
       </w:pPr>
-      <w:bookmarkStart w:id="45" w:name="_Toc231121744"/>
+      <w:bookmarkStart w:id="45" w:name="_Toc231135570"/>
       <w:r>
         <w:t>3.1.6 Comparación entre mercados</w:t>
       </w:r>
@@ -13331,7 +13334,7 @@
           <w:rFonts w:hint="eastAsia"/>
         </w:rPr>
       </w:pPr>
-      <w:bookmarkStart w:id="46" w:name="_Toc231121768"/>
+      <w:bookmarkStart w:id="46" w:name="_Toc231135594"/>
       <w:r>
         <w:rPr>
           <w:i w:val="0"/>
@@ -14009,7 +14012,7 @@
           <w:noProof/>
         </w:rPr>
         <w:drawing>
-          <wp:inline distT="0" distB="0" distL="0" distR="0" wp14:anchorId="605A7973" wp14:editId="09F21A6E">
+          <wp:inline distT="0" distB="0" distL="0" distR="0" wp14:anchorId="7ECB5A7F" wp14:editId="5A5BB76A">
             <wp:extent cx="5212080" cy="2626097"/>
             <wp:effectExtent l="0" t="0" r="0" b="0"/>
             <wp:docPr id="7" name="Picture 7"/>
@@ -14054,7 +14057,7 @@
           <w:rFonts w:hint="eastAsia"/>
         </w:rPr>
       </w:pPr>
-      <w:bookmarkStart w:id="47" w:name="_Toc231121786"/>
+      <w:bookmarkStart w:id="47" w:name="_Toc231135612"/>
       <w:r>
         <w:rPr>
           <w:i w:val="0"/>
@@ -14091,7 +14094,7 @@
       <w:pPr>
         <w:pStyle w:val="Ttulo3"/>
       </w:pPr>
-      <w:bookmarkStart w:id="48" w:name="_Toc231121745"/>
+      <w:bookmarkStart w:id="48" w:name="_Toc231135571"/>
       <w:r>
         <w:t>3.1.7 Diagnósticos y robustez</w:t>
       </w:r>
@@ -14131,7 +14134,7 @@
         </w:rPr>
         <w:lastRenderedPageBreak/>
         <w:drawing>
-          <wp:inline distT="0" distB="0" distL="0" distR="0" wp14:anchorId="27ECA5C9" wp14:editId="3CA0CFDC">
+          <wp:inline distT="0" distB="0" distL="0" distR="0" wp14:anchorId="0B985253" wp14:editId="6D9AF472">
             <wp:extent cx="5212080" cy="2651805"/>
             <wp:effectExtent l="0" t="0" r="0" b="0"/>
             <wp:docPr id="8" name="Picture 8"/>
@@ -14176,7 +14179,7 @@
           <w:rFonts w:hint="eastAsia"/>
         </w:rPr>
       </w:pPr>
-      <w:bookmarkStart w:id="49" w:name="_Toc231121787"/>
+      <w:bookmarkStart w:id="49" w:name="_Toc231135613"/>
       <w:r>
         <w:rPr>
           <w:i w:val="0"/>
@@ -14213,7 +14216,7 @@
       <w:pPr>
         <w:pStyle w:val="Ttulo2"/>
       </w:pPr>
-      <w:bookmarkStart w:id="50" w:name="_Toc231121746"/>
+      <w:bookmarkStart w:id="50" w:name="_Toc231135572"/>
       <w:r>
         <w:t>3.2 Discusión de Resultados</w:t>
       </w:r>
@@ -14343,7 +14346,7 @@
       <w:pPr>
         <w:pStyle w:val="Ttulo2"/>
       </w:pPr>
-      <w:bookmarkStart w:id="51" w:name="_Toc231121747"/>
+      <w:bookmarkStart w:id="51" w:name="_Toc231135573"/>
       <w:r>
         <w:t>3.3 Aporte práctico</w:t>
       </w:r>
@@ -14453,7 +14456,7 @@
       <w:pPr>
         <w:pStyle w:val="Ttulo1"/>
       </w:pPr>
-      <w:bookmarkStart w:id="52" w:name="_Toc231121748"/>
+      <w:bookmarkStart w:id="52" w:name="_Toc231135574"/>
       <w:r>
         <w:lastRenderedPageBreak/>
         <w:t>IV. CONCLUSIONES Y RECOMENDACIONES</w:t>
@@ -14464,7 +14467,7 @@
       <w:pPr>
         <w:pStyle w:val="Ttulo2"/>
       </w:pPr>
-      <w:bookmarkStart w:id="53" w:name="_Toc231121749"/>
+      <w:bookmarkStart w:id="53" w:name="_Toc231135575"/>
       <w:r>
         <w:t>4.1 Conclusiones</w:t>
       </w:r>
@@ -14587,7 +14590,7 @@
       <w:pPr>
         <w:pStyle w:val="Ttulo2"/>
       </w:pPr>
-      <w:bookmarkStart w:id="54" w:name="_Toc231121750"/>
+      <w:bookmarkStart w:id="54" w:name="_Toc231135576"/>
       <w:r>
         <w:t>4.2 Recomendaciones</w:t>
       </w:r>
@@ -14698,7 +14701,7 @@
       <w:pPr>
         <w:pStyle w:val="Ttulo1"/>
       </w:pPr>
-      <w:bookmarkStart w:id="55" w:name="_Toc231121751"/>
+      <w:bookmarkStart w:id="55" w:name="_Toc231135577"/>
       <w:r>
         <w:lastRenderedPageBreak/>
         <w:t>Referencias</w:t>
@@ -15673,7 +15676,7 @@
       <w:pPr>
         <w:pStyle w:val="Ttulo1"/>
       </w:pPr>
-      <w:bookmarkStart w:id="56" w:name="_Toc231121752"/>
+      <w:bookmarkStart w:id="56" w:name="_Toc231135578"/>
       <w:r>
         <w:lastRenderedPageBreak/>
         <w:t>Anexos</w:t>
@@ -15684,7 +15687,7 @@
       <w:pPr>
         <w:pStyle w:val="Ttulo2"/>
       </w:pPr>
-      <w:bookmarkStart w:id="57" w:name="_Toc231121753"/>
+      <w:bookmarkStart w:id="57" w:name="_Toc231135579"/>
       <w:r>
         <w:t>Anexo A. Estadística descriptiva</w:t>
       </w:r>
@@ -15699,7 +15702,7 @@
           <w:rFonts w:hint="eastAsia"/>
         </w:rPr>
       </w:pPr>
-      <w:bookmarkStart w:id="58" w:name="_Toc231121769"/>
+      <w:bookmarkStart w:id="58" w:name="_Toc231135595"/>
       <w:r>
         <w:rPr>
           <w:i w:val="0"/>
@@ -18165,7 +18168,7 @@
       <w:pPr>
         <w:pStyle w:val="Ttulo2"/>
       </w:pPr>
-      <w:bookmarkStart w:id="59" w:name="_Toc231121754"/>
+      <w:bookmarkStart w:id="59" w:name="_Toc231135580"/>
       <w:r>
         <w:t xml:space="preserve">Anexo B. Matriz de </w:t>
       </w:r>
@@ -18183,7 +18186,7 @@
           <w:rFonts w:hint="eastAsia"/>
         </w:rPr>
       </w:pPr>
-      <w:bookmarkStart w:id="60" w:name="_Toc231121770"/>
+      <w:bookmarkStart w:id="60" w:name="_Toc231135596"/>
       <w:r>
         <w:rPr>
           <w:i w:val="0"/>
@@ -20467,7 +20470,7 @@
       <w:pPr>
         <w:pStyle w:val="Ttulo2"/>
       </w:pPr>
-      <w:bookmarkStart w:id="61" w:name="_Toc231121755"/>
+      <w:bookmarkStart w:id="61" w:name="_Toc231135581"/>
       <w:r>
         <w:t xml:space="preserve">Anexo C. </w:t>
       </w:r>
@@ -20485,7 +20488,7 @@
           <w:rFonts w:hint="eastAsia"/>
         </w:rPr>
       </w:pPr>
-      <w:bookmarkStart w:id="62" w:name="_Toc231121771"/>
+      <w:bookmarkStart w:id="62" w:name="_Toc231135597"/>
       <w:r>
         <w:rPr>
           <w:i w:val="0"/>
@@ -21420,7 +21423,7 @@
       <w:pPr>
         <w:pStyle w:val="Ttulo2"/>
       </w:pPr>
-      <w:bookmarkStart w:id="63" w:name="_Toc231121756"/>
+      <w:bookmarkStart w:id="63" w:name="_Toc231135582"/>
       <w:r>
         <w:t>Anexo D. Resultados completos del modelo de panel</w:t>
       </w:r>
@@ -21430,7 +21433,7 @@
       <w:pPr>
         <w:pStyle w:val="Ttulo3"/>
       </w:pPr>
-      <w:bookmarkStart w:id="64" w:name="_Toc231121757"/>
+      <w:bookmarkStart w:id="64" w:name="_Toc231135583"/>
       <w:r>
         <w:t>D.1 Muestra B — cobre, mercado internacional</w:t>
       </w:r>
@@ -21445,7 +21448,7 @@
           <w:rFonts w:hint="eastAsia"/>
         </w:rPr>
       </w:pPr>
-      <w:bookmarkStart w:id="65" w:name="_Toc231121772"/>
+      <w:bookmarkStart w:id="65" w:name="_Toc231135598"/>
       <w:r>
         <w:rPr>
           <w:i w:val="0"/>
@@ -22773,7 +22776,7 @@
       <w:pPr>
         <w:pStyle w:val="Ttulo3"/>
       </w:pPr>
-      <w:bookmarkStart w:id="66" w:name="_Toc231121758"/>
+      <w:bookmarkStart w:id="66" w:name="_Toc231135584"/>
       <w:r>
         <w:t xml:space="preserve">D.2 </w:t>
       </w:r>
@@ -22791,7 +22794,7 @@
           <w:rFonts w:hint="eastAsia"/>
         </w:rPr>
       </w:pPr>
-      <w:bookmarkStart w:id="67" w:name="_Toc231121773"/>
+      <w:bookmarkStart w:id="67" w:name="_Toc231135599"/>
       <w:r>
         <w:rPr>
           <w:i w:val="0"/>
@@ -24112,7 +24115,7 @@
       <w:pPr>
         <w:pStyle w:val="Ttulo3"/>
       </w:pPr>
-      <w:bookmarkStart w:id="68" w:name="_Toc231121759"/>
+      <w:bookmarkStart w:id="68" w:name="_Toc231135585"/>
       <w:r>
         <w:t xml:space="preserve">D.3 Muestra C — </w:t>
       </w:r>
@@ -24130,7 +24133,7 @@
           <w:rFonts w:hint="eastAsia"/>
         </w:rPr>
       </w:pPr>
-      <w:bookmarkStart w:id="69" w:name="_Toc231121774"/>
+      <w:bookmarkStart w:id="69" w:name="_Toc231135600"/>
       <w:r>
         <w:rPr>
           <w:i w:val="0"/>
@@ -25452,7 +25455,7 @@
       <w:pPr>
         <w:pStyle w:val="Ttulo2"/>
       </w:pPr>
-      <w:bookmarkStart w:id="70" w:name="_Toc231121760"/>
+      <w:bookmarkStart w:id="70" w:name="_Toc231135586"/>
       <w:r>
         <w:t xml:space="preserve">Anexo E. Cointegración (test de </w:t>
       </w:r>
@@ -25470,7 +25473,7 @@
           <w:rFonts w:hint="eastAsia"/>
         </w:rPr>
       </w:pPr>
-      <w:bookmarkStart w:id="71" w:name="_Toc231121775"/>
+      <w:bookmarkStart w:id="71" w:name="_Toc231135601"/>
       <w:r>
         <w:rPr>
           <w:i w:val="0"/>
@@ -26219,7 +26222,7 @@
       <w:pPr>
         <w:pStyle w:val="Ttulo2"/>
       </w:pPr>
-      <w:bookmarkStart w:id="72" w:name="_Toc231121761"/>
+      <w:bookmarkStart w:id="72" w:name="_Toc231135587"/>
       <w:r>
         <w:t xml:space="preserve">Anexo F. </w:t>
       </w:r>
@@ -26237,7 +26240,7 @@
           <w:rFonts w:hint="eastAsia"/>
         </w:rPr>
       </w:pPr>
-      <w:bookmarkStart w:id="73" w:name="_Toc231121776"/>
+      <w:bookmarkStart w:id="73" w:name="_Toc231135602"/>
       <w:r>
         <w:rPr>
           <w:i w:val="0"/>
@@ -27147,7 +27150,7 @@
       <w:pPr>
         <w:pStyle w:val="Ttulo2"/>
       </w:pPr>
-      <w:bookmarkStart w:id="74" w:name="_Toc231121762"/>
+      <w:bookmarkStart w:id="74" w:name="_Toc231135588"/>
       <w:r>
         <w:t>Anexo G. Fuentes de datos</w:t>
       </w:r>
@@ -27162,7 +27165,7 @@
           <w:rFonts w:hint="eastAsia"/>
         </w:rPr>
       </w:pPr>
-      <w:bookmarkStart w:id="75" w:name="_Toc231121777"/>
+      <w:bookmarkStart w:id="75" w:name="_Toc231135603"/>
       <w:r>
         <w:rPr>
           <w:i w:val="0"/>
@@ -28449,7 +28452,7 @@
       <w:pPr>
         <w:pStyle w:val="Ttulo2"/>
       </w:pPr>
-      <w:bookmarkStart w:id="76" w:name="_Toc231121763"/>
+      <w:bookmarkStart w:id="76" w:name="_Toc231135589"/>
       <w:r>
         <w:t>Anexo H. Disponibilidad del código</w:t>
       </w:r>
@@ -28492,7 +28495,7 @@
       <w:pPr>
         <w:pStyle w:val="Ttulo2"/>
       </w:pPr>
-      <w:bookmarkStart w:id="77" w:name="_Toc231121764"/>
+      <w:bookmarkStart w:id="77" w:name="_Toc231135590"/>
       <w:r>
         <w:t>Anexo J. Síntesis de pruebas de diagnóstico y robustez</w:t>
       </w:r>
@@ -28520,7 +28523,7 @@
           <w:rFonts w:hint="eastAsia"/>
         </w:rPr>
       </w:pPr>
-      <w:bookmarkStart w:id="78" w:name="_Toc231121778"/>
+      <w:bookmarkStart w:id="78" w:name="_Toc231135604"/>
       <w:r>
         <w:rPr>
           <w:i w:val="0"/>
@@ -29794,7 +29797,7 @@
       <w:pPr>
         <w:pStyle w:val="Ttulo2"/>
       </w:pPr>
-      <w:bookmarkStart w:id="79" w:name="_Toc231121765"/>
+      <w:bookmarkStart w:id="79" w:name="_Toc231135591"/>
       <w:r>
         <w:t>Anexo I. Extensión predictiva: ¿explican o anticipan?</w:t>
       </w:r>
@@ -29828,7 +29831,7 @@
           <w:rFonts w:hint="eastAsia"/>
         </w:rPr>
       </w:pPr>
-      <w:bookmarkStart w:id="80" w:name="_Toc231121779"/>
+      <w:bookmarkStart w:id="80" w:name="_Toc231135605"/>
       <w:r>
         <w:rPr>
           <w:i w:val="0"/>
@@ -30750,7 +30753,7 @@
           <w:noProof/>
         </w:rPr>
         <w:drawing>
-          <wp:inline distT="0" distB="0" distL="0" distR="0" wp14:anchorId="0052FB79" wp14:editId="0A860E8D">
+          <wp:inline distT="0" distB="0" distL="0" distR="0" wp14:anchorId="6CA09F64" wp14:editId="690FA168">
             <wp:extent cx="5212080" cy="2524564"/>
             <wp:effectExtent l="0" t="0" r="0" b="0"/>
             <wp:docPr id="9" name="Picture 9"/>
@@ -30795,7 +30798,7 @@
           <w:rFonts w:hint="eastAsia"/>
         </w:rPr>
       </w:pPr>
-      <w:bookmarkStart w:id="81" w:name="_Toc231121788"/>
+      <w:bookmarkStart w:id="81" w:name="_Toc231135614"/>
       <w:r>
         <w:rPr>
           <w:i w:val="0"/>
@@ -31259,31 +31262,31 @@
       </w:rPr>
     </w:lvl>
   </w:abstractNum>
-  <w:num w:numId="1" w16cid:durableId="112748395">
+  <w:num w:numId="1" w16cid:durableId="336931167">
     <w:abstractNumId w:val="8"/>
   </w:num>
-  <w:num w:numId="2" w16cid:durableId="1660310794">
+  <w:num w:numId="2" w16cid:durableId="1042435156">
     <w:abstractNumId w:val="6"/>
   </w:num>
-  <w:num w:numId="3" w16cid:durableId="1627420872">
+  <w:num w:numId="3" w16cid:durableId="1685785247">
     <w:abstractNumId w:val="5"/>
   </w:num>
-  <w:num w:numId="4" w16cid:durableId="1546480463">
+  <w:num w:numId="4" w16cid:durableId="532154395">
     <w:abstractNumId w:val="4"/>
   </w:num>
-  <w:num w:numId="5" w16cid:durableId="1977837041">
+  <w:num w:numId="5" w16cid:durableId="24792449">
     <w:abstractNumId w:val="7"/>
   </w:num>
-  <w:num w:numId="6" w16cid:durableId="342047774">
+  <w:num w:numId="6" w16cid:durableId="868495276">
     <w:abstractNumId w:val="3"/>
   </w:num>
-  <w:num w:numId="7" w16cid:durableId="2117947401">
+  <w:num w:numId="7" w16cid:durableId="636029407">
     <w:abstractNumId w:val="2"/>
   </w:num>
-  <w:num w:numId="8" w16cid:durableId="1263999077">
+  <w:num w:numId="8" w16cid:durableId="443691029">
     <w:abstractNumId w:val="1"/>
   </w:num>
-  <w:num w:numId="9" w16cid:durableId="767232141">
+  <w:num w:numId="9" w16cid:durableId="815999056">
     <w:abstractNumId w:val="0"/>
   </w:num>
 </w:numbering>
@@ -42685,7 +42688,7 @@
     <w:autoRedefine/>
     <w:uiPriority w:val="39"/>
     <w:unhideWhenUsed/>
-    <w:rsid w:val="005A07B8"/>
+    <w:rsid w:val="00A63069"/>
     <w:pPr>
       <w:spacing w:after="100"/>
     </w:pPr>
@@ -42697,7 +42700,7 @@
     <w:autoRedefine/>
     <w:uiPriority w:val="39"/>
     <w:unhideWhenUsed/>
-    <w:rsid w:val="005A07B8"/>
+    <w:rsid w:val="00A63069"/>
     <w:pPr>
       <w:spacing w:after="100"/>
       <w:ind w:left="240"/>
@@ -42710,7 +42713,7 @@
     <w:autoRedefine/>
     <w:uiPriority w:val="39"/>
     <w:unhideWhenUsed/>
-    <w:rsid w:val="005A07B8"/>
+    <w:rsid w:val="00A63069"/>
     <w:pPr>
       <w:spacing w:after="100"/>
       <w:ind w:left="480"/>
@@ -42721,7 +42724,7 @@
     <w:basedOn w:val="Fuentedeprrafopredeter"/>
     <w:uiPriority w:val="99"/>
     <w:unhideWhenUsed/>
-    <w:rsid w:val="005A07B8"/>
+    <w:rsid w:val="00A63069"/>
     <w:rPr>
       <w:color w:val="0000FF" w:themeColor="hyperlink"/>
       <w:u w:val="single"/>
@@ -42733,7 +42736,7 @@
     <w:next w:val="Normal"/>
     <w:uiPriority w:val="99"/>
     <w:unhideWhenUsed/>
-    <w:rsid w:val="005A07B8"/>
+    <w:rsid w:val="00A63069"/>
     <w:pPr>
       <w:spacing w:after="0"/>
     </w:pPr>

</xml_diff>